<commit_message>
updated resume rendering and user edits
</commit_message>
<xml_diff>
--- a/notebooks/resume-builder/sources/Master Resume.docx
+++ b/notebooks/resume-builder/sources/Master Resume.docx
@@ -281,78 +281,114 @@
     </w:p>
     <w:p>
       <w:pPr>
-        <w:pStyle w:val="Body A"/>
+        <w:pStyle w:val="Default"/>
+        <w:suppressAutoHyphens w:val="1"/>
         <w:spacing w:before="240" w:after="240"/>
-      </w:pPr>
-      <w:r>
-        <w:rPr>
-          <w:rtl w:val="0"/>
+        <w:rPr>
+          <w:rFonts w:ascii="Arial" w:cs="Arial" w:hAnsi="Arial" w:eastAsia="Arial"/>
+          <w:sz w:val="22"/>
+          <w:szCs w:val="22"/>
+        </w:rPr>
+      </w:pPr>
+      <w:r>
+        <w:rPr>
+          <w:rFonts w:ascii="Arial" w:hAnsi="Arial" w:hint="default"/>
+          <w:sz w:val="22"/>
+          <w:szCs w:val="22"/>
+          <w:rtl w:val="0"/>
+          <w:lang w:val="en-US"/>
         </w:rPr>
         <w:t xml:space="preserve">• </w:t>
       </w:r>
       <w:r>
         <w:rPr>
-          <w:rtl w:val="0"/>
-          <w:lang w:val="en-US"/>
-        </w:rPr>
-        <w:t>Led analytical readiness assessment for Oracle/EBS and Maximo data migrated to BigQuery, establishing the foundation for cross-domain analytics across construction operations and financial systems.</w:t>
-      </w:r>
-    </w:p>
-    <w:p>
-      <w:pPr>
-        <w:pStyle w:val="Body A"/>
-        <w:spacing w:before="240" w:after="240"/>
-      </w:pPr>
-      <w:r>
-        <w:rPr>
-          <w:rtl w:val="0"/>
-        </w:rPr>
+          <w:rFonts w:ascii="Arial" w:hAnsi="Arial"/>
+          <w:sz w:val="22"/>
+          <w:szCs w:val="22"/>
+          <w:rtl w:val="0"/>
+          <w:lang w:val="en-US"/>
+        </w:rPr>
+        <w:t>Built a governed analytics assistant using Gemini, BigQuery, and tool-calling architectures that applied analyst rules, operational controls, and auditable execution patterns for AI-enabled construction and financial analytics.</w:t>
+      </w:r>
+      <w:r>
+        <w:rPr>
+          <w:rFonts w:ascii="Arial" w:cs="Arial" w:hAnsi="Arial" w:eastAsia="Arial"/>
+          <w:sz w:val="22"/>
+          <w:szCs w:val="22"/>
+          <w:rtl w:val="0"/>
+        </w:rPr>
+        <w:br w:type="textWrapping"/>
         <w:t xml:space="preserve">• </w:t>
       </w:r>
       <w:r>
         <w:rPr>
+          <w:rFonts w:ascii="Arial" w:hAnsi="Arial"/>
+          <w:sz w:val="22"/>
+          <w:szCs w:val="22"/>
+          <w:rtl w:val="0"/>
+          <w:lang w:val="en-US"/>
+        </w:rPr>
+        <w:t>Led analytical readiness assessment for Oracle/EBS and Maximo data migrated to BigQuery, establishing cross-domain analytics across construction operations and financial systems.</w:t>
+      </w:r>
+      <w:r>
+        <w:rPr>
+          <w:rFonts w:ascii="Arial" w:cs="Arial" w:hAnsi="Arial" w:eastAsia="Arial"/>
+          <w:sz w:val="22"/>
+          <w:szCs w:val="22"/>
+          <w:rtl w:val="0"/>
+        </w:rPr>
+        <w:br w:type="textWrapping"/>
+        <w:t xml:space="preserve">• </w:t>
+      </w:r>
+      <w:r>
+        <w:rPr>
+          <w:rFonts w:ascii="Arial" w:hAnsi="Arial"/>
+          <w:sz w:val="22"/>
+          <w:szCs w:val="22"/>
           <w:rtl w:val="0"/>
           <w:lang w:val="en-US"/>
         </w:rPr>
         <w:t>Developed automated profiling, type inference, duplicate detection, candidate key analysis, and cross-system join validation frameworks across 100+ source tables and millions of operational and financial records.</w:t>
       </w:r>
-    </w:p>
-    <w:p>
-      <w:pPr>
-        <w:pStyle w:val="Body A"/>
-        <w:spacing w:before="240" w:after="240"/>
-      </w:pPr>
-      <w:r>
-        <w:rPr>
-          <w:rtl w:val="0"/>
-        </w:rPr>
+      <w:r>
+        <w:rPr>
+          <w:rFonts w:ascii="Arial" w:cs="Arial" w:hAnsi="Arial" w:eastAsia="Arial"/>
+          <w:sz w:val="22"/>
+          <w:szCs w:val="22"/>
+          <w:rtl w:val="0"/>
+        </w:rPr>
+        <w:br w:type="textWrapping"/>
         <w:t xml:space="preserve">• </w:t>
       </w:r>
       <w:r>
         <w:rPr>
-          <w:rtl w:val="0"/>
-          <w:lang w:val="en-US"/>
-        </w:rPr>
-        <w:t>Developed a phased analytical maturity roadmap adopted as the foundation for anomaly detection, construction analytics, and AI-enabled decision support initiatives.</w:t>
-      </w:r>
-    </w:p>
-    <w:p>
-      <w:pPr>
-        <w:pStyle w:val="Body A"/>
-        <w:spacing w:before="240" w:after="240"/>
-      </w:pPr>
-      <w:r>
-        <w:rPr>
-          <w:rtl w:val="0"/>
-        </w:rPr>
+          <w:rFonts w:ascii="Arial" w:hAnsi="Arial"/>
+          <w:sz w:val="22"/>
+          <w:szCs w:val="22"/>
+          <w:rtl w:val="0"/>
+          <w:lang w:val="en-US"/>
+        </w:rPr>
+        <w:t>Designed peer-group and time-series anomaly detection readiness frameworks for construction actuals, including data suitability checks, gap analysis, nonzero filtering, and category-level cost behavior analysis.</w:t>
+      </w:r>
+      <w:r>
+        <w:rPr>
+          <w:rFonts w:ascii="Arial" w:cs="Arial" w:hAnsi="Arial" w:eastAsia="Arial"/>
+          <w:sz w:val="22"/>
+          <w:szCs w:val="22"/>
+          <w:rtl w:val="0"/>
+        </w:rPr>
+        <w:br w:type="textWrapping"/>
         <w:t xml:space="preserve">• </w:t>
       </w:r>
       <w:r>
         <w:rPr>
-          <w:rtl w:val="0"/>
-          <w:lang w:val="en-US"/>
-        </w:rPr>
-        <w:t>Built a governed analytics assistant using Gemini, BigQuery, and tool-calling architectures that applied analyst rules and operational controls while maintaining predictable and auditable execution.</w:t>
+          <w:rFonts w:ascii="Arial" w:hAnsi="Arial"/>
+          <w:sz w:val="22"/>
+          <w:szCs w:val="22"/>
+          <w:rtl w:val="0"/>
+          <w:lang w:val="en-US"/>
+        </w:rPr>
+        <w:t>Developed a phased analytical maturity roadmap for anomaly detection, construction analytics, and AI-enabled decision support initiatives.</w:t>
       </w:r>
     </w:p>
     <w:p>
@@ -475,841 +511,808 @@
           <w:bCs w:val="1"/>
           <w:rtl w:val="0"/>
         </w:rPr>
-        <w:t>AI Instructor | SimpliLearn | October 2025 - Present</w:t>
-      </w:r>
-    </w:p>
-    <w:p>
-      <w:pPr>
-        <w:pStyle w:val="Body A"/>
-        <w:spacing w:before="240" w:after="240"/>
-      </w:pPr>
-      <w:r>
-        <w:rPr>
-          <w:rtl w:val="0"/>
-        </w:rPr>
-        <w:t xml:space="preserve">• </w:t>
-      </w:r>
-      <w:r>
-        <w:rPr>
-          <w:rtl w:val="0"/>
-          <w:lang w:val="en-US"/>
-        </w:rPr>
-        <w:t>Delivered professional AI training across multi-month cohorts for software engineers, data scientists, and technical professionals through university- and enterprise-sponsored continuing education programs.</w:t>
-      </w:r>
-    </w:p>
-    <w:p>
-      <w:pPr>
-        <w:pStyle w:val="Body A"/>
-        <w:spacing w:before="240" w:after="240"/>
-      </w:pPr>
-      <w:r>
-        <w:rPr>
-          <w:rtl w:val="0"/>
-        </w:rPr>
-        <w:t xml:space="preserve">• </w:t>
-      </w:r>
-      <w:r>
-        <w:rPr>
-          <w:rtl w:val="0"/>
-          <w:lang w:val="en-US"/>
-        </w:rPr>
-        <w:t>Taught transformer architectures, LLMs, RAG, agentic AI, multimodal AI, MCP, diffusion models, and enterprise AI governance.</w:t>
-      </w:r>
-    </w:p>
-    <w:p>
-      <w:pPr>
-        <w:pStyle w:val="Body A"/>
-        <w:spacing w:before="240" w:after="240"/>
-      </w:pPr>
-      <w:r>
-        <w:rPr>
-          <w:rtl w:val="0"/>
-        </w:rPr>
-        <w:t xml:space="preserve">• </w:t>
-      </w:r>
-      <w:r>
-        <w:rPr>
-          <w:rtl w:val="0"/>
-          <w:lang w:val="en-US"/>
-        </w:rPr>
-        <w:t>Developed hands-on demonstrations, Jupyter notebooks, and end-to-end applications covering modern AI workflows, evaluation techniques, and deployment considerations.</w:t>
-      </w:r>
-    </w:p>
-    <w:p>
-      <w:pPr>
-        <w:pStyle w:val="Body A"/>
-        <w:spacing w:before="240" w:after="240"/>
-      </w:pPr>
-      <w:r>
-        <w:rPr>
-          <w:rtl w:val="0"/>
-        </w:rPr>
-        <w:t xml:space="preserve">• </w:t>
-      </w:r>
-      <w:r>
-        <w:rPr>
-          <w:rtl w:val="0"/>
-          <w:lang w:val="en-US"/>
-        </w:rPr>
-        <w:t>Mentored students on AI architecture, governance, implementation tradeoffs, and enterprise adoption strategies.</w:t>
-      </w:r>
-    </w:p>
-    <w:p>
-      <w:pPr>
-        <w:pStyle w:val="Body A"/>
-        <w:spacing w:before="240" w:after="240"/>
+        <w:t xml:space="preserve">AI Instructor | SimpliLearn </w:t>
+      </w:r>
+      <w:r>
         <w:rPr>
           <w:b w:val="1"/>
           <w:bCs w:val="1"/>
-        </w:rPr>
-      </w:pPr>
-    </w:p>
-    <w:p>
-      <w:pPr>
-        <w:pStyle w:val="Body A"/>
-        <w:spacing w:before="240" w:after="240"/>
+          <w:rtl w:val="0"/>
+          <w:lang w:val="en-US"/>
+        </w:rPr>
+        <w:t xml:space="preserve">&amp; Interview Kickstart </w:t>
+      </w:r>
+      <w:r>
         <w:rPr>
           <w:b w:val="1"/>
           <w:bCs w:val="1"/>
-        </w:rPr>
-      </w:pPr>
+          <w:rtl w:val="0"/>
+        </w:rPr>
+        <w:t xml:space="preserve">| </w:t>
+      </w:r>
       <w:r>
         <w:rPr>
           <w:b w:val="1"/>
           <w:bCs w:val="1"/>
           <w:rtl w:val="0"/>
-        </w:rPr>
-        <w:t>AI Instructor | Interview Kickstart | March 2025 - Present</w:t>
-      </w:r>
-    </w:p>
-    <w:p>
-      <w:pPr>
-        <w:pStyle w:val="Body A"/>
+          <w:lang w:val="en-US"/>
+        </w:rPr>
+        <w:t>March 2025 - Present</w:t>
+      </w:r>
+    </w:p>
+    <w:p>
+      <w:pPr>
+        <w:pStyle w:val="Default"/>
+        <w:suppressAutoHyphens w:val="1"/>
         <w:spacing w:before="240" w:after="240"/>
-      </w:pPr>
-      <w:r>
-        <w:rPr>
-          <w:rtl w:val="0"/>
-        </w:rPr>
-        <w:t xml:space="preserve">• </w:t>
-      </w:r>
-      <w:r>
-        <w:rPr>
-          <w:rtl w:val="0"/>
-          <w:lang w:val="en-US"/>
-        </w:rPr>
-        <w:t>Delivered AI and machine learning instruction for software engineering professionals pursuing advanced technical roles.</w:t>
-      </w:r>
-    </w:p>
-    <w:p>
-      <w:pPr>
-        <w:pStyle w:val="Body A"/>
-        <w:spacing w:before="240" w:after="240"/>
-      </w:pPr>
-      <w:r>
-        <w:rPr>
-          <w:rtl w:val="0"/>
-        </w:rPr>
-        <w:t xml:space="preserve">• </w:t>
-      </w:r>
-      <w:r>
-        <w:rPr>
-          <w:rtl w:val="0"/>
-          <w:lang w:val="en-US"/>
-        </w:rPr>
-        <w:t>Taught practical applications of LLMs, RAG, agentic AI, and modern AI development workflows.</w:t>
-      </w:r>
-    </w:p>
-    <w:p>
-      <w:pPr>
-        <w:pStyle w:val="Body A"/>
-        <w:spacing w:before="240" w:after="240"/>
-      </w:pPr>
-      <w:r>
-        <w:rPr>
-          <w:rtl w:val="0"/>
-        </w:rPr>
-        <w:t xml:space="preserve">• </w:t>
-      </w:r>
-      <w:r>
-        <w:rPr>
-          <w:rtl w:val="0"/>
-          <w:lang w:val="en-US"/>
-        </w:rPr>
-        <w:t>Mentored students on AI architecture, implementation patterns, and technology selection tradeoffs.</w:t>
-      </w:r>
-    </w:p>
-    <w:p>
-      <w:pPr>
-        <w:pStyle w:val="Body A"/>
-        <w:spacing w:before="240" w:after="240"/>
-        <w:rPr>
+        <w:rPr>
+          <w:rFonts w:ascii="Arial" w:cs="Arial" w:hAnsi="Arial" w:eastAsia="Arial"/>
+          <w:sz w:val="22"/>
+          <w:szCs w:val="22"/>
+        </w:rPr>
+      </w:pPr>
+      <w:r>
+        <w:rPr>
+          <w:rFonts w:ascii="Arial" w:hAnsi="Arial" w:hint="default"/>
           <w:b w:val="1"/>
           <w:bCs w:val="1"/>
-        </w:rPr>
-      </w:pPr>
-      <w:r>
+          <w:rtl w:val="0"/>
+          <w:lang w:val="en-US"/>
+        </w:rPr>
+        <w:t>•</w:t>
+      </w:r>
+      <w:r>
+        <w:rPr>
+          <w:rFonts w:ascii="Arial" w:hAnsi="Arial"/>
+          <w:sz w:val="22"/>
+          <w:szCs w:val="22"/>
+          <w:rtl w:val="0"/>
+          <w:lang w:val="en-US"/>
+        </w:rPr>
+        <w:t xml:space="preserve"> Delivered AI and machine learning training across multi-month cohorts for software engineers, data scientists, and technical professionals through university- and enterprise-sponsored continuing education programs.</w:t>
+      </w:r>
+      <w:r>
+        <w:rPr>
+          <w:rFonts w:ascii="Arial" w:cs="Arial" w:hAnsi="Arial" w:eastAsia="Arial"/>
+          <w:sz w:val="22"/>
+          <w:szCs w:val="22"/>
+          <w:rtl w:val="0"/>
+        </w:rPr>
+        <w:br w:type="textWrapping"/>
+        <w:t xml:space="preserve">• </w:t>
+      </w:r>
+      <w:r>
+        <w:rPr>
+          <w:rFonts w:ascii="Arial" w:hAnsi="Arial"/>
+          <w:sz w:val="22"/>
+          <w:szCs w:val="22"/>
+          <w:rtl w:val="0"/>
+          <w:lang w:val="en-US"/>
+        </w:rPr>
+        <w:t>Taught transformer architectures, LLMs, RAG, agentic AI, multimodal AI, MCP, diffusion models, enterprise AI governance, and practical AI development workflows.</w:t>
+      </w:r>
+      <w:r>
+        <w:rPr>
+          <w:rFonts w:ascii="Arial" w:cs="Arial" w:hAnsi="Arial" w:eastAsia="Arial"/>
+          <w:sz w:val="22"/>
+          <w:szCs w:val="22"/>
+          <w:rtl w:val="0"/>
+        </w:rPr>
+        <w:br w:type="textWrapping"/>
+        <w:t xml:space="preserve">• </w:t>
+      </w:r>
+      <w:r>
+        <w:rPr>
+          <w:rFonts w:ascii="Arial" w:hAnsi="Arial"/>
+          <w:sz w:val="22"/>
+          <w:szCs w:val="22"/>
+          <w:rtl w:val="0"/>
+          <w:lang w:val="en-US"/>
+        </w:rPr>
+        <w:t>Developed hands-on demonstrations, Jupyter notebooks, and end-to-end applications covering modern AI workflows, evaluation techniques, and deployment considerations.</w:t>
+      </w:r>
+      <w:r>
+        <w:rPr>
+          <w:rFonts w:ascii="Arial" w:cs="Arial" w:hAnsi="Arial" w:eastAsia="Arial"/>
+          <w:sz w:val="22"/>
+          <w:szCs w:val="22"/>
+          <w:rtl w:val="0"/>
+        </w:rPr>
+        <w:br w:type="textWrapping"/>
+        <w:t xml:space="preserve">• </w:t>
+      </w:r>
+      <w:r>
+        <w:rPr>
+          <w:rFonts w:ascii="Arial" w:hAnsi="Arial"/>
+          <w:sz w:val="22"/>
+          <w:szCs w:val="22"/>
+          <w:rtl w:val="0"/>
+          <w:lang w:val="en-US"/>
+        </w:rPr>
+        <w:t>Mentored students on AI architecture, governance, implementation tradeoffs, and enterprise adoption strategies.</w:t>
+      </w:r>
+    </w:p>
+    <w:p>
+      <w:pPr>
+        <w:pStyle w:val="Default"/>
+        <w:suppressAutoHyphens w:val="1"/>
+        <w:spacing w:before="0" w:after="240" w:line="240" w:lineRule="auto"/>
+        <w:rPr>
+          <w:rFonts w:ascii="Times Roman" w:cs="Times Roman" w:hAnsi="Times Roman" w:eastAsia="Times Roman"/>
+        </w:rPr>
+      </w:pPr>
+    </w:p>
+    <w:p>
+      <w:pPr>
+        <w:pStyle w:val="Body A"/>
+        <w:spacing w:before="240" w:after="240"/>
         <w:rPr>
           <w:b w:val="1"/>
           <w:bCs w:val="1"/>
-          <w:rtl w:val="0"/>
-        </w:rPr>
-        <w:t>Data Scientist | Intuit (via The Cydio Group) | Apr 2025 - Jul 2025</w:t>
-      </w:r>
-    </w:p>
-    <w:p>
-      <w:pPr>
-        <w:pStyle w:val="Body A"/>
-        <w:spacing w:before="240" w:after="240"/>
-      </w:pPr>
-      <w:r>
-        <w:rPr>
-          <w:rtl w:val="0"/>
-        </w:rPr>
-        <w:t xml:space="preserve">• </w:t>
-      </w:r>
-      <w:r>
-        <w:rPr>
-          <w:rtl w:val="0"/>
-          <w:lang w:val="en-US"/>
-        </w:rPr>
-        <w:t>Delivered analytics supporting business and operational decision-making for QuickBooks Capital.</w:t>
-      </w:r>
-    </w:p>
-    <w:p>
-      <w:pPr>
-        <w:pStyle w:val="Body A"/>
-        <w:spacing w:before="240" w:after="240"/>
-      </w:pPr>
-      <w:r>
-        <w:rPr>
-          <w:rtl w:val="0"/>
-        </w:rPr>
-        <w:t xml:space="preserve">• </w:t>
-      </w:r>
-      <w:r>
-        <w:rPr>
-          <w:rtl w:val="0"/>
-          <w:lang w:val="en-US"/>
-        </w:rPr>
-        <w:t>Investigated attribution anomalies across customer acquisition funnels, marketing campaigns, and conversion pathways to improve measurement accuracy and identify emerging business trends.</w:t>
-      </w:r>
-    </w:p>
-    <w:p>
-      <w:pPr>
-        <w:pStyle w:val="Body A"/>
-        <w:spacing w:before="240" w:after="240"/>
-      </w:pPr>
-      <w:r>
-        <w:rPr>
-          <w:rtl w:val="0"/>
-        </w:rPr>
-        <w:t xml:space="preserve">• </w:t>
-      </w:r>
-      <w:r>
-        <w:rPr>
-          <w:rtl w:val="0"/>
-          <w:lang w:val="en-US"/>
-        </w:rPr>
-        <w:t>Consolidated fragmented reporting into unified Tableau dashboards and automated executive reporting workflows using Python and SQL, reducing report preparation from days to hours.</w:t>
-      </w:r>
-    </w:p>
-    <w:p>
-      <w:pPr>
-        <w:pStyle w:val="Body A"/>
-        <w:spacing w:before="240" w:after="240"/>
-      </w:pPr>
-      <w:r>
-        <w:rPr>
-          <w:rtl w:val="0"/>
-        </w:rPr>
-        <w:t xml:space="preserve">• </w:t>
-      </w:r>
-      <w:r>
-        <w:rPr>
-          <w:rtl w:val="0"/>
-          <w:lang w:val="en-US"/>
-        </w:rPr>
-        <w:t>Partnered with finance, marketing, and product stakeholders to translate attribution and performance data into actionable business recommendations.</w:t>
-      </w:r>
-    </w:p>
-    <w:p>
-      <w:pPr>
-        <w:pStyle w:val="Body A"/>
-        <w:spacing w:before="240" w:after="240"/>
-      </w:pPr>
-    </w:p>
-    <w:p>
-      <w:pPr>
-        <w:pStyle w:val="Body A"/>
-        <w:spacing w:before="240" w:after="240"/>
+        </w:rPr>
+      </w:pPr>
+      <w:r>
         <w:rPr>
           <w:b w:val="1"/>
           <w:bCs w:val="1"/>
-        </w:rPr>
-      </w:pPr>
-      <w:r>
+          <w:rtl w:val="0"/>
+        </w:rPr>
+        <w:t>Data Scientist | Intuit (via The Cydio Group) | Apr 2025 - Jul 2025</w:t>
+      </w:r>
+    </w:p>
+    <w:p>
+      <w:pPr>
+        <w:pStyle w:val="Body A"/>
+        <w:spacing w:before="240" w:after="240"/>
+      </w:pPr>
+      <w:r>
+        <w:rPr>
+          <w:rtl w:val="0"/>
+        </w:rPr>
+        <w:t xml:space="preserve">• </w:t>
+      </w:r>
+      <w:r>
+        <w:rPr>
+          <w:rtl w:val="0"/>
+          <w:lang w:val="en-US"/>
+        </w:rPr>
+        <w:t>Delivered analytics supporting business and operational decision-making for QuickBooks Capital.</w:t>
+      </w:r>
+    </w:p>
+    <w:p>
+      <w:pPr>
+        <w:pStyle w:val="Body A"/>
+        <w:spacing w:before="240" w:after="240"/>
+      </w:pPr>
+      <w:r>
+        <w:rPr>
+          <w:rtl w:val="0"/>
+        </w:rPr>
+        <w:t xml:space="preserve">• </w:t>
+      </w:r>
+      <w:r>
+        <w:rPr>
+          <w:rtl w:val="0"/>
+          <w:lang w:val="en-US"/>
+        </w:rPr>
+        <w:t>Investigated attribution anomalies across customer acquisition funnels, marketing campaigns, and conversion pathways to improve measurement accuracy and identify emerging business trends.</w:t>
+      </w:r>
+    </w:p>
+    <w:p>
+      <w:pPr>
+        <w:pStyle w:val="Body A"/>
+        <w:spacing w:before="240" w:after="240"/>
+      </w:pPr>
+      <w:r>
+        <w:rPr>
+          <w:rtl w:val="0"/>
+        </w:rPr>
+        <w:t xml:space="preserve">• </w:t>
+      </w:r>
+      <w:r>
+        <w:rPr>
+          <w:rtl w:val="0"/>
+          <w:lang w:val="en-US"/>
+        </w:rPr>
+        <w:t>Consolidated fragmented reporting into unified Tableau dashboards and automated executive reporting workflows using Python and SQL, reducing report preparation from days to hours.</w:t>
+      </w:r>
+    </w:p>
+    <w:p>
+      <w:pPr>
+        <w:pStyle w:val="Body A"/>
+        <w:spacing w:before="240" w:after="240"/>
+      </w:pPr>
+      <w:r>
+        <w:rPr>
+          <w:rtl w:val="0"/>
+        </w:rPr>
+        <w:t xml:space="preserve">• </w:t>
+      </w:r>
+      <w:r>
+        <w:rPr>
+          <w:rtl w:val="0"/>
+          <w:lang w:val="en-US"/>
+        </w:rPr>
+        <w:t>Partnered with finance, marketing, and product stakeholders to translate attribution and performance data into actionable business recommendations.</w:t>
+      </w:r>
+    </w:p>
+    <w:p>
+      <w:pPr>
+        <w:pStyle w:val="Body A"/>
+        <w:spacing w:before="240" w:after="240"/>
+      </w:pPr>
+    </w:p>
+    <w:p>
+      <w:pPr>
+        <w:pStyle w:val="Body A"/>
+        <w:spacing w:before="240" w:after="240"/>
         <w:rPr>
           <w:b w:val="1"/>
           <w:bCs w:val="1"/>
-          <w:rtl w:val="0"/>
-        </w:rPr>
-        <w:t>Data Scientist | Meta | October 2021 - January 2025</w:t>
-      </w:r>
-    </w:p>
-    <w:p>
-      <w:pPr>
-        <w:pStyle w:val="Body A"/>
-        <w:spacing w:before="240" w:after="240"/>
-      </w:pPr>
-      <w:r>
-        <w:rPr>
-          <w:rtl w:val="0"/>
-        </w:rPr>
-        <w:t xml:space="preserve">• </w:t>
-      </w:r>
-      <w:r>
-        <w:rPr>
-          <w:rtl w:val="0"/>
-          <w:lang w:val="en-US"/>
-        </w:rPr>
-        <w:t>Defined reliability KPIs and measurement frameworks for Meta FinTech, establishing leading indicators used to guide reliability planning, prioritization, and performance management.</w:t>
-      </w:r>
-    </w:p>
-    <w:p>
-      <w:pPr>
-        <w:pStyle w:val="Body A"/>
-        <w:spacing w:before="240" w:after="240"/>
-      </w:pPr>
-      <w:r>
-        <w:rPr>
-          <w:rtl w:val="0"/>
-        </w:rPr>
-        <w:t xml:space="preserve">• </w:t>
-      </w:r>
-      <w:r>
-        <w:rPr>
-          <w:rtl w:val="0"/>
-          <w:lang w:val="en-US"/>
-        </w:rPr>
-        <w:t>Developed forecasting and performance-management frameworks across business pillars and sub-pillars, translating engineering initiatives into projected reliability outcomes used for planning, goal setting, and leadership decision-making.</w:t>
-      </w:r>
-    </w:p>
-    <w:p>
-      <w:pPr>
-        <w:pStyle w:val="Body A"/>
-        <w:spacing w:before="240" w:after="240"/>
-      </w:pPr>
-      <w:r>
-        <w:rPr>
-          <w:rtl w:val="0"/>
-        </w:rPr>
-        <w:t xml:space="preserve">• </w:t>
-      </w:r>
-      <w:r>
-        <w:rPr>
-          <w:rtl w:val="0"/>
-          <w:lang w:val="en-US"/>
-        </w:rPr>
-        <w:t>Built attribution frameworks linking incidents, alerts, defects, and operational metrics to engineering organizations and service ownership structures, enabling more accurate accountability and performance measurement.</w:t>
-      </w:r>
-    </w:p>
-    <w:p>
-      <w:pPr>
-        <w:pStyle w:val="Body A"/>
-        <w:spacing w:before="240" w:after="240"/>
-      </w:pPr>
-      <w:r>
-        <w:rPr>
-          <w:rtl w:val="0"/>
-        </w:rPr>
-        <w:t xml:space="preserve">• </w:t>
-      </w:r>
-      <w:r>
-        <w:rPr>
-          <w:rtl w:val="0"/>
-          <w:lang w:val="en-US"/>
-        </w:rPr>
-        <w:t>Designed and developed the ReMon framework, enabling engineering teams to build comprehensive monitoring and alerting systems without requiring expertise in complex internal tooling; adopted across Meta FinTech, contributing to the automatic detection of more than 15 SEVs in 2024.</w:t>
-      </w:r>
-    </w:p>
-    <w:p>
-      <w:pPr>
-        <w:pStyle w:val="Body A"/>
-        <w:spacing w:before="240" w:after="240"/>
-      </w:pPr>
-      <w:r>
-        <w:rPr>
-          <w:rtl w:val="0"/>
-        </w:rPr>
-        <w:t xml:space="preserve">• </w:t>
-      </w:r>
-      <w:r>
-        <w:rPr>
-          <w:rtl w:val="0"/>
-          <w:lang w:val="en-US"/>
-        </w:rPr>
-        <w:t>Delivered impact sizing, ROI, and risk exposure analyses supporting investment and prioritization decisions across platform reliability, privacy compliance, authentication, testing infrastructure, and data platform initiatives.</w:t>
-      </w:r>
-    </w:p>
-    <w:p>
-      <w:pPr>
-        <w:pStyle w:val="Body A"/>
-        <w:spacing w:before="240" w:after="240"/>
-      </w:pPr>
-    </w:p>
-    <w:p>
-      <w:pPr>
-        <w:pStyle w:val="Body A"/>
-        <w:spacing w:before="240" w:after="240"/>
+        </w:rPr>
+      </w:pPr>
+      <w:r>
         <w:rPr>
           <w:b w:val="1"/>
           <w:bCs w:val="1"/>
-        </w:rPr>
-      </w:pPr>
-      <w:r>
+          <w:rtl w:val="0"/>
+        </w:rPr>
+        <w:t>Data Scientist | Meta | October 2021 - January 2025</w:t>
+      </w:r>
+    </w:p>
+    <w:p>
+      <w:pPr>
+        <w:pStyle w:val="Body A"/>
+        <w:spacing w:before="240" w:after="240"/>
+      </w:pPr>
+      <w:r>
+        <w:rPr>
+          <w:rtl w:val="0"/>
+        </w:rPr>
+        <w:t xml:space="preserve">• </w:t>
+      </w:r>
+      <w:r>
+        <w:rPr>
+          <w:rtl w:val="0"/>
+          <w:lang w:val="en-US"/>
+        </w:rPr>
+        <w:t>Defined reliability KPIs and measurement frameworks for Meta FinTech, establishing leading indicators used to guide reliability planning, prioritization, and performance management.</w:t>
+      </w:r>
+    </w:p>
+    <w:p>
+      <w:pPr>
+        <w:pStyle w:val="Body A"/>
+        <w:spacing w:before="240" w:after="240"/>
+      </w:pPr>
+      <w:r>
+        <w:rPr>
+          <w:rtl w:val="0"/>
+        </w:rPr>
+        <w:t xml:space="preserve">• </w:t>
+      </w:r>
+      <w:r>
+        <w:rPr>
+          <w:rtl w:val="0"/>
+          <w:lang w:val="en-US"/>
+        </w:rPr>
+        <w:t>Developed forecasting and performance-management frameworks across business pillars and sub-pillars, translating engineering initiatives into projected reliability outcomes used for planning, goal setting, and leadership decision-making.</w:t>
+      </w:r>
+    </w:p>
+    <w:p>
+      <w:pPr>
+        <w:pStyle w:val="Body A"/>
+        <w:spacing w:before="240" w:after="240"/>
+      </w:pPr>
+      <w:r>
+        <w:rPr>
+          <w:rtl w:val="0"/>
+        </w:rPr>
+        <w:t xml:space="preserve">• </w:t>
+      </w:r>
+      <w:r>
+        <w:rPr>
+          <w:rtl w:val="0"/>
+          <w:lang w:val="en-US"/>
+        </w:rPr>
+        <w:t>Built attribution frameworks linking incidents, alerts, defects, and operational metrics to engineering organizations and service ownership structures, enabling more accurate accountability and performance measurement.</w:t>
+      </w:r>
+    </w:p>
+    <w:p>
+      <w:pPr>
+        <w:pStyle w:val="Body A"/>
+        <w:spacing w:before="240" w:after="240"/>
+      </w:pPr>
+      <w:r>
+        <w:rPr>
+          <w:rtl w:val="0"/>
+        </w:rPr>
+        <w:t xml:space="preserve">• </w:t>
+      </w:r>
+      <w:r>
+        <w:rPr>
+          <w:rtl w:val="0"/>
+          <w:lang w:val="en-US"/>
+        </w:rPr>
+        <w:t>Designed and developed the ReMon framework, enabling engineering teams to build comprehensive monitoring and alerting systems without requiring expertise in complex internal tooling; adopted across Meta FinTech, contributing to the automatic detection of more than 15 SEVs in 2024.</w:t>
+      </w:r>
+    </w:p>
+    <w:p>
+      <w:pPr>
+        <w:pStyle w:val="Body A"/>
+        <w:spacing w:before="240" w:after="240"/>
+      </w:pPr>
+      <w:r>
+        <w:rPr>
+          <w:rtl w:val="0"/>
+        </w:rPr>
+        <w:t xml:space="preserve">• </w:t>
+      </w:r>
+      <w:r>
+        <w:rPr>
+          <w:rtl w:val="0"/>
+          <w:lang w:val="en-US"/>
+        </w:rPr>
+        <w:t>Delivered impact sizing, ROI, and risk exposure analyses supporting investment and prioritization decisions across platform reliability, privacy compliance, authentication, testing infrastructure, and data platform initiatives.</w:t>
+      </w:r>
+    </w:p>
+    <w:p>
+      <w:pPr>
+        <w:pStyle w:val="Body A"/>
+        <w:spacing w:before="240" w:after="240"/>
+      </w:pPr>
+    </w:p>
+    <w:p>
+      <w:pPr>
+        <w:pStyle w:val="Body A"/>
+        <w:spacing w:before="240" w:after="240"/>
         <w:rPr>
           <w:b w:val="1"/>
           <w:bCs w:val="1"/>
-          <w:rtl w:val="0"/>
-        </w:rPr>
-        <w:t>Data Scientist | Samsung Electronics (via Harvey Nash) | Dec 2020 - Oct 2021</w:t>
-      </w:r>
-    </w:p>
-    <w:p>
-      <w:pPr>
-        <w:pStyle w:val="Body A"/>
-        <w:spacing w:before="240" w:after="240"/>
-      </w:pPr>
-      <w:r>
-        <w:rPr>
-          <w:rtl w:val="0"/>
-        </w:rPr>
-        <w:t xml:space="preserve">• </w:t>
-      </w:r>
-      <w:r>
-        <w:rPr>
-          <w:rtl w:val="0"/>
-          <w:lang w:val="en-US"/>
-        </w:rPr>
-        <w:t>Developed and deployed gradient-boosting propensity models used to target digital marketing campaigns, increasing campaign conversions by 146% and campaign-attributed revenue by 229%.</w:t>
-      </w:r>
-    </w:p>
-    <w:p>
-      <w:pPr>
-        <w:pStyle w:val="Body A"/>
-        <w:spacing w:before="240" w:after="240"/>
-      </w:pPr>
-      <w:r>
-        <w:rPr>
-          <w:rtl w:val="0"/>
-        </w:rPr>
-        <w:t xml:space="preserve">• </w:t>
-      </w:r>
-      <w:r>
-        <w:rPr>
-          <w:rtl w:val="0"/>
-          <w:lang w:val="en-US"/>
-        </w:rPr>
-        <w:t>Built customer sentiment analysis pipelines using NLTK and survey data to identify product and customer experience insights.</w:t>
-      </w:r>
-    </w:p>
-    <w:p>
-      <w:pPr>
-        <w:pStyle w:val="Body A"/>
-        <w:spacing w:before="240" w:after="240"/>
-      </w:pPr>
-      <w:r>
-        <w:rPr>
-          <w:rtl w:val="0"/>
-        </w:rPr>
-        <w:t xml:space="preserve">• </w:t>
-      </w:r>
-      <w:r>
-        <w:rPr>
-          <w:rtl w:val="0"/>
-          <w:lang w:val="en-US"/>
-        </w:rPr>
-        <w:t>Automated audience segmentation and campaign targeting workflows, improving efficiency and scalability across digital marketing initiatives.</w:t>
-      </w:r>
-    </w:p>
-    <w:p>
-      <w:pPr>
-        <w:pStyle w:val="Body A"/>
-        <w:spacing w:before="240" w:after="240"/>
-      </w:pPr>
-      <w:r>
-        <w:rPr>
-          <w:rtl w:val="0"/>
-        </w:rPr>
-        <w:t xml:space="preserve">• </w:t>
-      </w:r>
-      <w:r>
-        <w:rPr>
-          <w:rtl w:val="0"/>
-          <w:lang w:val="en-US"/>
-        </w:rPr>
-        <w:t>Improved marketing attribution and performance measurement capabilities through predictive modeling and analytics-driven decision support.</w:t>
-      </w:r>
-    </w:p>
-    <w:p>
-      <w:pPr>
-        <w:pStyle w:val="Body A"/>
-        <w:spacing w:before="240" w:after="240"/>
-      </w:pPr>
-    </w:p>
-    <w:p>
-      <w:pPr>
-        <w:pStyle w:val="Body A"/>
-        <w:spacing w:before="240" w:after="240"/>
+        </w:rPr>
+      </w:pPr>
+      <w:r>
         <w:rPr>
           <w:b w:val="1"/>
           <w:bCs w:val="1"/>
-        </w:rPr>
-      </w:pPr>
-      <w:r>
+          <w:rtl w:val="0"/>
+        </w:rPr>
+        <w:t>Data Scientist | Samsung Electronics (via Harvey Nash) | Dec 2020 - Oct 2021</w:t>
+      </w:r>
+    </w:p>
+    <w:p>
+      <w:pPr>
+        <w:pStyle w:val="Body A"/>
+        <w:spacing w:before="240" w:after="240"/>
+      </w:pPr>
+      <w:r>
+        <w:rPr>
+          <w:rtl w:val="0"/>
+        </w:rPr>
+        <w:t xml:space="preserve">• </w:t>
+      </w:r>
+      <w:r>
+        <w:rPr>
+          <w:rtl w:val="0"/>
+          <w:lang w:val="en-US"/>
+        </w:rPr>
+        <w:t>Developed and deployed gradient-boosting propensity models used to target digital marketing campaigns, increasing campaign conversions by 146% and campaign-attributed revenue by 229%.</w:t>
+      </w:r>
+    </w:p>
+    <w:p>
+      <w:pPr>
+        <w:pStyle w:val="Body A"/>
+        <w:spacing w:before="240" w:after="240"/>
+      </w:pPr>
+      <w:r>
+        <w:rPr>
+          <w:rtl w:val="0"/>
+        </w:rPr>
+        <w:t xml:space="preserve">• </w:t>
+      </w:r>
+      <w:r>
+        <w:rPr>
+          <w:rtl w:val="0"/>
+          <w:lang w:val="en-US"/>
+        </w:rPr>
+        <w:t>Built customer sentiment analysis pipelines using NLTK and survey data to identify product and customer experience insights.</w:t>
+      </w:r>
+    </w:p>
+    <w:p>
+      <w:pPr>
+        <w:pStyle w:val="Body A"/>
+        <w:spacing w:before="240" w:after="240"/>
+      </w:pPr>
+      <w:r>
+        <w:rPr>
+          <w:rtl w:val="0"/>
+        </w:rPr>
+        <w:t xml:space="preserve">• </w:t>
+      </w:r>
+      <w:r>
+        <w:rPr>
+          <w:rtl w:val="0"/>
+          <w:lang w:val="en-US"/>
+        </w:rPr>
+        <w:t>Automated audience segmentation and campaign targeting workflows, improving efficiency and scalability across digital marketing initiatives.</w:t>
+      </w:r>
+    </w:p>
+    <w:p>
+      <w:pPr>
+        <w:pStyle w:val="Body A"/>
+        <w:spacing w:before="240" w:after="240"/>
+      </w:pPr>
+      <w:r>
+        <w:rPr>
+          <w:rtl w:val="0"/>
+        </w:rPr>
+        <w:t xml:space="preserve">• </w:t>
+      </w:r>
+      <w:r>
+        <w:rPr>
+          <w:rtl w:val="0"/>
+          <w:lang w:val="en-US"/>
+        </w:rPr>
+        <w:t>Improved marketing attribution and performance measurement capabilities through predictive modeling and analytics-driven decision support.</w:t>
+      </w:r>
+    </w:p>
+    <w:p>
+      <w:pPr>
+        <w:pStyle w:val="Body A"/>
+        <w:spacing w:before="240" w:after="240"/>
+      </w:pPr>
+    </w:p>
+    <w:p>
+      <w:pPr>
+        <w:pStyle w:val="Body A"/>
+        <w:spacing w:before="240" w:after="240"/>
         <w:rPr>
           <w:b w:val="1"/>
           <w:bCs w:val="1"/>
-          <w:rtl w:val="0"/>
-        </w:rPr>
-        <w:t>Head of Data Science | Facteus | Oct 2017 - Nov 2020</w:t>
-      </w:r>
-    </w:p>
-    <w:p>
-      <w:pPr>
-        <w:pStyle w:val="Body A"/>
-        <w:spacing w:before="240" w:after="240"/>
-      </w:pPr>
-      <w:r>
-        <w:rPr>
-          <w:rtl w:val="0"/>
-        </w:rPr>
-        <w:t xml:space="preserve">• </w:t>
-      </w:r>
-      <w:r>
-        <w:rPr>
-          <w:rtl w:val="0"/>
-          <w:lang w:val="en-US"/>
-        </w:rPr>
-        <w:t>Led data science initiatives on a 30B+ transaction dataset, creating analytical products and market-intelligence capabilities through large-scale feature engineering, merchant intelligence, and consumer-spending analytics.</w:t>
-      </w:r>
-    </w:p>
-    <w:p>
-      <w:pPr>
-        <w:pStyle w:val="Body A"/>
-        <w:spacing w:before="240" w:after="240"/>
-      </w:pPr>
-      <w:r>
-        <w:rPr>
-          <w:rtl w:val="0"/>
-        </w:rPr>
-        <w:t xml:space="preserve">• </w:t>
-      </w:r>
-      <w:r>
-        <w:rPr>
-          <w:rtl w:val="0"/>
-          <w:lang w:val="en-US"/>
-        </w:rPr>
-        <w:t>Developed merchant, brand, industry, and storefront resolution methodologies that transformed cryptic payment-card transactions into business-identifiable entities, enabling accurate market intelligence across more than 1,700 businesses with greater than 99% transaction coverage.</w:t>
-      </w:r>
-    </w:p>
-    <w:p>
-      <w:pPr>
-        <w:pStyle w:val="Body A"/>
-        <w:spacing w:before="240" w:after="240"/>
-      </w:pPr>
-      <w:r>
-        <w:rPr>
-          <w:rtl w:val="0"/>
-        </w:rPr>
-        <w:t xml:space="preserve">• </w:t>
-      </w:r>
-      <w:r>
-        <w:rPr>
-          <w:rtl w:val="0"/>
-          <w:lang w:val="en-US"/>
-        </w:rPr>
-        <w:t>Evaluated prospective data partnerships by assessing signal quality, coverage, and business value, supporting strategic investment and acquisition decisions.</w:t>
-      </w:r>
-    </w:p>
-    <w:p>
-      <w:pPr>
-        <w:pStyle w:val="Body A"/>
-        <w:spacing w:before="240" w:after="240"/>
-      </w:pPr>
-      <w:r>
-        <w:rPr>
-          <w:rtl w:val="0"/>
-        </w:rPr>
-        <w:t xml:space="preserve">• </w:t>
-      </w:r>
-      <w:r>
-        <w:rPr>
-          <w:rtl w:val="0"/>
-          <w:lang w:val="en-US"/>
-        </w:rPr>
-        <w:t>Produced transaction-based industry analyses during the COVID-19 pandemic, identifying shifts in consumer behavior, regional economic impacts, and e-commerce adoption trends before traditional reporting sources became available.</w:t>
-      </w:r>
-    </w:p>
-    <w:p>
-      <w:pPr>
-        <w:pStyle w:val="Body A"/>
-        <w:spacing w:before="240" w:after="240"/>
-      </w:pPr>
-      <w:r>
-        <w:rPr>
-          <w:rtl w:val="0"/>
-        </w:rPr>
-        <w:t xml:space="preserve">• </w:t>
-      </w:r>
-      <w:r>
-        <w:rPr>
-          <w:rtl w:val="0"/>
-          <w:lang w:val="en-US"/>
-        </w:rPr>
-        <w:t>Created data-driven reports and visualizations used by hedge funds, partners, and internal stakeholders to understand emerging market trends and business performance.</w:t>
-      </w:r>
-    </w:p>
-    <w:p>
-      <w:pPr>
-        <w:pStyle w:val="Body A"/>
-        <w:spacing w:before="240" w:after="240"/>
-      </w:pPr>
-    </w:p>
-    <w:p>
-      <w:pPr>
-        <w:pStyle w:val="Body A"/>
-        <w:spacing w:before="240" w:after="240"/>
+        </w:rPr>
+      </w:pPr>
+      <w:r>
         <w:rPr>
           <w:b w:val="1"/>
           <w:bCs w:val="1"/>
-        </w:rPr>
-      </w:pPr>
-      <w:r>
+          <w:rtl w:val="0"/>
+        </w:rPr>
+        <w:t>Head of Data Science | Facteus | Oct 2017 - Nov 2020</w:t>
+      </w:r>
+    </w:p>
+    <w:p>
+      <w:pPr>
+        <w:pStyle w:val="Body A"/>
+        <w:spacing w:before="240" w:after="240"/>
+      </w:pPr>
+      <w:r>
+        <w:rPr>
+          <w:rtl w:val="0"/>
+        </w:rPr>
+        <w:t xml:space="preserve">• </w:t>
+      </w:r>
+      <w:r>
+        <w:rPr>
+          <w:rtl w:val="0"/>
+          <w:lang w:val="en-US"/>
+        </w:rPr>
+        <w:t>Led data science initiatives on a 30B+ transaction dataset, creating analytical products and market-intelligence capabilities through large-scale feature engineering, merchant intelligence, and consumer-spending analytics.</w:t>
+      </w:r>
+    </w:p>
+    <w:p>
+      <w:pPr>
+        <w:pStyle w:val="Body A"/>
+        <w:spacing w:before="240" w:after="240"/>
+      </w:pPr>
+      <w:r>
+        <w:rPr>
+          <w:rtl w:val="0"/>
+        </w:rPr>
+        <w:t xml:space="preserve">• </w:t>
+      </w:r>
+      <w:r>
+        <w:rPr>
+          <w:rtl w:val="0"/>
+          <w:lang w:val="en-US"/>
+        </w:rPr>
+        <w:t>Developed merchant, brand, industry, and storefront resolution methodologies that transformed cryptic payment-card transactions into business-identifiable entities, enabling accurate market intelligence across more than 1,700 businesses with greater than 99% transaction coverage.</w:t>
+      </w:r>
+    </w:p>
+    <w:p>
+      <w:pPr>
+        <w:pStyle w:val="Body A"/>
+        <w:spacing w:before="240" w:after="240"/>
+      </w:pPr>
+      <w:r>
+        <w:rPr>
+          <w:rtl w:val="0"/>
+        </w:rPr>
+        <w:t xml:space="preserve">• </w:t>
+      </w:r>
+      <w:r>
+        <w:rPr>
+          <w:rtl w:val="0"/>
+          <w:lang w:val="en-US"/>
+        </w:rPr>
+        <w:t>Evaluated prospective data partnerships by assessing signal quality, coverage, and business value, supporting strategic investment and acquisition decisions.</w:t>
+      </w:r>
+    </w:p>
+    <w:p>
+      <w:pPr>
+        <w:pStyle w:val="Body A"/>
+        <w:spacing w:before="240" w:after="240"/>
+      </w:pPr>
+      <w:r>
+        <w:rPr>
+          <w:rtl w:val="0"/>
+        </w:rPr>
+        <w:t xml:space="preserve">• </w:t>
+      </w:r>
+      <w:r>
+        <w:rPr>
+          <w:rtl w:val="0"/>
+          <w:lang w:val="en-US"/>
+        </w:rPr>
+        <w:t>Produced transaction-based industry analyses during the COVID-19 pandemic, identifying shifts in consumer behavior, regional economic impacts, and e-commerce adoption trends before traditional reporting sources became available.</w:t>
+      </w:r>
+    </w:p>
+    <w:p>
+      <w:pPr>
+        <w:pStyle w:val="Body A"/>
+        <w:spacing w:before="240" w:after="240"/>
+      </w:pPr>
+      <w:r>
+        <w:rPr>
+          <w:rtl w:val="0"/>
+        </w:rPr>
+        <w:t xml:space="preserve">• </w:t>
+      </w:r>
+      <w:r>
+        <w:rPr>
+          <w:rtl w:val="0"/>
+          <w:lang w:val="en-US"/>
+        </w:rPr>
+        <w:t>Created data-driven reports and visualizations used by hedge funds, partners, and internal stakeholders to understand emerging market trends and business performance.</w:t>
+      </w:r>
+    </w:p>
+    <w:p>
+      <w:pPr>
+        <w:pStyle w:val="Body A"/>
+        <w:spacing w:before="240" w:after="240"/>
+      </w:pPr>
+    </w:p>
+    <w:p>
+      <w:pPr>
+        <w:pStyle w:val="Body A"/>
+        <w:spacing w:before="240" w:after="240"/>
         <w:rPr>
           <w:b w:val="1"/>
           <w:bCs w:val="1"/>
-          <w:rtl w:val="0"/>
-        </w:rPr>
-        <w:t>Expert SEO Solutions Architect | Nike (via Intersoft Inc.) | Nov 2016 - Sep 2017</w:t>
-      </w:r>
-    </w:p>
-    <w:p>
-      <w:pPr>
-        <w:pStyle w:val="Body A"/>
-        <w:spacing w:before="240" w:after="240"/>
-      </w:pPr>
-      <w:r>
-        <w:rPr>
-          <w:rtl w:val="0"/>
-        </w:rPr>
-        <w:t xml:space="preserve">• </w:t>
-      </w:r>
-      <w:r>
-        <w:rPr>
-          <w:rtl w:val="0"/>
-          <w:lang w:val="en-US"/>
-        </w:rPr>
-        <w:t>Designed a scalable SEO and information-architecture framework for Nike's product discovery experience, balancing customer navigation paths with search-engine indexation requirements across a rapidly expanding product catalog.</w:t>
-      </w:r>
-    </w:p>
-    <w:p>
-      <w:pPr>
-        <w:pStyle w:val="Body A"/>
-        <w:spacing w:before="240" w:after="240"/>
-      </w:pPr>
-      <w:r>
-        <w:rPr>
-          <w:rtl w:val="0"/>
-        </w:rPr>
-        <w:t xml:space="preserve">• </w:t>
-      </w:r>
-      <w:r>
-        <w:rPr>
-          <w:rtl w:val="0"/>
-          <w:lang w:val="en-US"/>
-        </w:rPr>
-        <w:t>Developed canonical URL, redirect, and XML sitemap strategies that improved search visibility while preventing duplicate content, redirect conflicts, and circular routing issues.</w:t>
-      </w:r>
-    </w:p>
-    <w:p>
-      <w:pPr>
-        <w:pStyle w:val="Body A"/>
-        <w:spacing w:before="240" w:after="240"/>
-      </w:pPr>
-      <w:r>
-        <w:rPr>
-          <w:rtl w:val="0"/>
-        </w:rPr>
-        <w:t xml:space="preserve">• </w:t>
-      </w:r>
-      <w:r>
-        <w:rPr>
-          <w:rtl w:val="0"/>
-          <w:lang w:val="en-US"/>
-        </w:rPr>
-        <w:t>Built Node.js proof-of-concept solutions demonstrating the feasibility and effectiveness of proposed SEO approaches, supporting adoption by business and engineering teams.</w:t>
-      </w:r>
-    </w:p>
-    <w:p>
-      <w:pPr>
-        <w:pStyle w:val="Body A"/>
-        <w:spacing w:before="240" w:after="240"/>
-      </w:pPr>
-    </w:p>
-    <w:p>
-      <w:pPr>
-        <w:pStyle w:val="Body A"/>
-        <w:spacing w:before="240" w:after="240"/>
+        </w:rPr>
+      </w:pPr>
+      <w:r>
         <w:rPr>
           <w:b w:val="1"/>
           <w:bCs w:val="1"/>
-        </w:rPr>
-      </w:pPr>
-      <w:r>
+          <w:rtl w:val="0"/>
+        </w:rPr>
+        <w:t>Expert SEO Solutions Architect | Nike (via Intersoft Inc.) | Nov 2016 - Sep 2017</w:t>
+      </w:r>
+    </w:p>
+    <w:p>
+      <w:pPr>
+        <w:pStyle w:val="Body A"/>
+        <w:spacing w:before="240" w:after="240"/>
+      </w:pPr>
+      <w:r>
+        <w:rPr>
+          <w:rtl w:val="0"/>
+        </w:rPr>
+        <w:t xml:space="preserve">• </w:t>
+      </w:r>
+      <w:r>
+        <w:rPr>
+          <w:rtl w:val="0"/>
+          <w:lang w:val="en-US"/>
+        </w:rPr>
+        <w:t>Designed a scalable SEO and information-architecture framework for Nike's product discovery experience, balancing customer navigation paths with search-engine indexation requirements across a rapidly expanding product catalog.</w:t>
+      </w:r>
+    </w:p>
+    <w:p>
+      <w:pPr>
+        <w:pStyle w:val="Body A"/>
+        <w:spacing w:before="240" w:after="240"/>
+      </w:pPr>
+      <w:r>
+        <w:rPr>
+          <w:rtl w:val="0"/>
+        </w:rPr>
+        <w:t xml:space="preserve">• </w:t>
+      </w:r>
+      <w:r>
+        <w:rPr>
+          <w:rtl w:val="0"/>
+          <w:lang w:val="en-US"/>
+        </w:rPr>
+        <w:t>Developed canonical URL, redirect, and XML sitemap strategies that improved search visibility while preventing duplicate content, redirect conflicts, and circular routing issues.</w:t>
+      </w:r>
+    </w:p>
+    <w:p>
+      <w:pPr>
+        <w:pStyle w:val="Body A"/>
+        <w:spacing w:before="240" w:after="240"/>
+      </w:pPr>
+      <w:r>
+        <w:rPr>
+          <w:rtl w:val="0"/>
+        </w:rPr>
+        <w:t xml:space="preserve">• </w:t>
+      </w:r>
+      <w:r>
+        <w:rPr>
+          <w:rtl w:val="0"/>
+          <w:lang w:val="en-US"/>
+        </w:rPr>
+        <w:t>Built Node.js proof-of-concept solutions demonstrating the feasibility and effectiveness of proposed SEO approaches, supporting adoption by business and engineering teams.</w:t>
+      </w:r>
+    </w:p>
+    <w:p>
+      <w:pPr>
+        <w:pStyle w:val="Body A"/>
+        <w:spacing w:before="240" w:after="240"/>
+      </w:pPr>
+    </w:p>
+    <w:p>
+      <w:pPr>
+        <w:pStyle w:val="Body A"/>
+        <w:spacing w:before="240" w:after="240"/>
         <w:rPr>
           <w:b w:val="1"/>
           <w:bCs w:val="1"/>
-          <w:rtl w:val="0"/>
-          <w:lang w:val="en-US"/>
-        </w:rPr>
-        <w:t>Senior Manager, Operations Analysis | Capital One | Jan 2012 - Dec 2016</w:t>
-      </w:r>
-    </w:p>
-    <w:p>
-      <w:pPr>
-        <w:pStyle w:val="Body A"/>
-        <w:spacing w:before="240" w:after="240"/>
-      </w:pPr>
-      <w:r>
-        <w:rPr>
-          <w:rtl w:val="0"/>
-        </w:rPr>
-        <w:t xml:space="preserve">• </w:t>
-      </w:r>
-      <w:r>
-        <w:rPr>
-          <w:rtl w:val="0"/>
-          <w:lang w:val="en-US"/>
-        </w:rPr>
-        <w:t>Developed predictive capacity-management models for customer-facing banking platforms, forecasting peak demand scenarios using customer-demand, temporal, and business-process drivers to support infrastructure planning and risk management.</w:t>
-      </w:r>
-    </w:p>
-    <w:p>
-      <w:pPr>
-        <w:pStyle w:val="Body A"/>
-        <w:spacing w:before="240" w:after="240"/>
-      </w:pPr>
-      <w:r>
-        <w:rPr>
-          <w:rtl w:val="0"/>
-        </w:rPr>
-        <w:t xml:space="preserve">• </w:t>
-      </w:r>
-      <w:r>
-        <w:rPr>
-          <w:rtl w:val="0"/>
-          <w:lang w:val="en-US"/>
-        </w:rPr>
-        <w:t>Identified critical gaps in enterprise monitoring operations after discovering that major incidents were frequently detected by customer call channels rather than operational monitoring systems.</w:t>
-      </w:r>
-    </w:p>
-    <w:p>
-      <w:pPr>
-        <w:pStyle w:val="Body A"/>
-        <w:spacing w:before="240" w:after="240"/>
-      </w:pPr>
-      <w:r>
-        <w:rPr>
-          <w:rtl w:val="0"/>
-        </w:rPr>
-        <w:t xml:space="preserve">• </w:t>
-      </w:r>
-      <w:r>
-        <w:rPr>
-          <w:rtl w:val="0"/>
-          <w:lang w:val="en-US"/>
-        </w:rPr>
-        <w:t>Conceived, designed, and led adoption of RITHM (Real-Time IT Health Monitoring), an operational intelligence platform that aggregated monitoring signals by business capability and system ownership, reducing major incident detection times from hours to minutes.</w:t>
-      </w:r>
-    </w:p>
-    <w:p>
-      <w:pPr>
-        <w:pStyle w:val="Body A"/>
-        <w:spacing w:before="240" w:after="240"/>
-      </w:pPr>
-      <w:r>
-        <w:rPr>
-          <w:rtl w:val="0"/>
-        </w:rPr>
-        <w:t xml:space="preserve">• </w:t>
-      </w:r>
-      <w:r>
-        <w:rPr>
-          <w:rtl w:val="0"/>
-          <w:lang w:val="en-US"/>
-        </w:rPr>
-        <w:t>Secured executive sponsorship for enterprise monitoring modernization, expanding initial Splunk-based prototypes into a scalable Kafka and Elastic Stack solution aligned with Capital One's open-source strategy.</w:t>
-      </w:r>
-    </w:p>
-    <w:p>
-      <w:pPr>
-        <w:pStyle w:val="Body A"/>
-        <w:spacing w:before="240" w:after="240"/>
-      </w:pPr>
-      <w:r>
-        <w:rPr>
-          <w:rtl w:val="0"/>
-        </w:rPr>
-        <w:t xml:space="preserve">• </w:t>
-      </w:r>
-      <w:r>
-        <w:rPr>
-          <w:rtl w:val="0"/>
-          <w:lang w:val="en-US"/>
-        </w:rPr>
-        <w:t>Partnered with CTO-level leadership to define enterprise monitoring strategy, operational health metrics, and reliability-improvement initiatives.</w:t>
-      </w:r>
-    </w:p>
-    <w:p>
-      <w:pPr>
-        <w:pStyle w:val="Body A"/>
-        <w:spacing w:before="240" w:after="240"/>
-      </w:pPr>
-      <w:r>
-        <w:rPr>
-          <w:rtl w:val="0"/>
-        </w:rPr>
-        <w:t xml:space="preserve">• </w:t>
-      </w:r>
-      <w:r>
-        <w:rPr>
-          <w:rtl w:val="0"/>
-          <w:lang w:val="en-US"/>
-        </w:rPr>
-        <w:t>Awarded the Capital One Business Innovation Award for contributions to operational intelligence and enterprise monitoring transformation; presented work at internal and external industry conferences.</w:t>
-      </w:r>
-    </w:p>
-    <w:p>
-      <w:pPr>
-        <w:pStyle w:val="Body A"/>
-        <w:spacing w:before="240" w:after="240"/>
-      </w:pPr>
-    </w:p>
-    <w:p>
-      <w:pPr>
-        <w:pStyle w:val="Body A"/>
-        <w:spacing w:before="240" w:after="240"/>
+        </w:rPr>
+      </w:pPr>
+      <w:r>
         <w:rPr>
           <w:b w:val="1"/>
           <w:bCs w:val="1"/>
-        </w:rPr>
-      </w:pPr>
-      <w:r>
+          <w:rtl w:val="0"/>
+          <w:lang w:val="en-US"/>
+        </w:rPr>
+        <w:t>Senior Manager, Operations Analysis | Capital One | Jan 2012 - Dec 2016</w:t>
+      </w:r>
+    </w:p>
+    <w:p>
+      <w:pPr>
+        <w:pStyle w:val="Body A"/>
+        <w:spacing w:before="240" w:after="240"/>
+      </w:pPr>
+      <w:r>
+        <w:rPr>
+          <w:rtl w:val="0"/>
+        </w:rPr>
+        <w:t xml:space="preserve">• </w:t>
+      </w:r>
+      <w:r>
+        <w:rPr>
+          <w:rtl w:val="0"/>
+          <w:lang w:val="en-US"/>
+        </w:rPr>
+        <w:t>Developed predictive capacity-management models for customer-facing banking platforms, forecasting peak demand scenarios using customer-demand, temporal, and business-process drivers to support infrastructure planning and risk management.</w:t>
+      </w:r>
+    </w:p>
+    <w:p>
+      <w:pPr>
+        <w:pStyle w:val="Body A"/>
+        <w:spacing w:before="240" w:after="240"/>
+      </w:pPr>
+      <w:r>
+        <w:rPr>
+          <w:rtl w:val="0"/>
+        </w:rPr>
+        <w:t xml:space="preserve">• </w:t>
+      </w:r>
+      <w:r>
+        <w:rPr>
+          <w:rtl w:val="0"/>
+          <w:lang w:val="en-US"/>
+        </w:rPr>
+        <w:t>Identified critical gaps in enterprise monitoring operations after discovering that major incidents were frequently detected by customer call channels rather than operational monitoring systems.</w:t>
+      </w:r>
+    </w:p>
+    <w:p>
+      <w:pPr>
+        <w:pStyle w:val="Body A"/>
+        <w:spacing w:before="240" w:after="240"/>
+      </w:pPr>
+      <w:r>
+        <w:rPr>
+          <w:rtl w:val="0"/>
+        </w:rPr>
+        <w:t xml:space="preserve">• </w:t>
+      </w:r>
+      <w:r>
+        <w:rPr>
+          <w:rtl w:val="0"/>
+          <w:lang w:val="en-US"/>
+        </w:rPr>
+        <w:t>Conceived, designed, and led adoption of RITHM (Real-Time IT Health Monitoring), an operational intelligence platform that aggregated monitoring signals by business capability and system ownership, reducing major incident detection times from hours to minutes.</w:t>
+      </w:r>
+    </w:p>
+    <w:p>
+      <w:pPr>
+        <w:pStyle w:val="Body A"/>
+        <w:spacing w:before="240" w:after="240"/>
+      </w:pPr>
+      <w:r>
+        <w:rPr>
+          <w:rtl w:val="0"/>
+        </w:rPr>
+        <w:t xml:space="preserve">• </w:t>
+      </w:r>
+      <w:r>
+        <w:rPr>
+          <w:rtl w:val="0"/>
+          <w:lang w:val="en-US"/>
+        </w:rPr>
+        <w:t>Secured executive sponsorship for enterprise monitoring modernization, expanding initial Splunk-based prototypes into a scalable Kafka and Elastic Stack solution aligned with Capital One's open-source strategy.</w:t>
+      </w:r>
+    </w:p>
+    <w:p>
+      <w:pPr>
+        <w:pStyle w:val="Body A"/>
+        <w:spacing w:before="240" w:after="240"/>
+      </w:pPr>
+      <w:r>
+        <w:rPr>
+          <w:rtl w:val="0"/>
+        </w:rPr>
+        <w:t xml:space="preserve">• </w:t>
+      </w:r>
+      <w:r>
+        <w:rPr>
+          <w:rtl w:val="0"/>
+          <w:lang w:val="en-US"/>
+        </w:rPr>
+        <w:t>Partnered with CTO-level leadership to define enterprise monitoring strategy, operational health metrics, and reliability-improvement initiatives.</w:t>
+      </w:r>
+    </w:p>
+    <w:p>
+      <w:pPr>
+        <w:pStyle w:val="Body A"/>
+        <w:spacing w:before="240" w:after="240"/>
+      </w:pPr>
+      <w:r>
+        <w:rPr>
+          <w:rtl w:val="0"/>
+        </w:rPr>
+        <w:t xml:space="preserve">• </w:t>
+      </w:r>
+      <w:r>
+        <w:rPr>
+          <w:rtl w:val="0"/>
+          <w:lang w:val="en-US"/>
+        </w:rPr>
+        <w:t>Awarded the Capital One Business Innovation Award for contributions to operational intelligence and enterprise monitoring transformation; presented work at internal and external industry conferences.</w:t>
+      </w:r>
+    </w:p>
+    <w:p>
+      <w:pPr>
+        <w:pStyle w:val="Body A"/>
+        <w:spacing w:before="240" w:after="240"/>
+      </w:pPr>
+    </w:p>
+    <w:p>
+      <w:pPr>
+        <w:pStyle w:val="Body A"/>
+        <w:spacing w:before="240" w:after="240"/>
         <w:rPr>
           <w:b w:val="1"/>
           <w:bCs w:val="1"/>
+        </w:rPr>
+      </w:pPr>
+      <w:r>
+        <w:rPr>
+          <w:b w:val="1"/>
+          <w:bCs w:val="1"/>
           <w:rtl w:val="0"/>
         </w:rPr>
         <w:t>Senior Principal Systems Engineer / Program Manager | Raytheon | Mar 2005 - Dec 2011</w:t>
@@ -1494,49 +1497,123 @@
         <w:rPr>
           <w:rtl w:val="0"/>
         </w:rPr>
-        <w:t xml:space="preserve">Agentic Multimodal Orchestrator | GitHub | 2025 </w:t>
-      </w:r>
-      <w:r>
-        <w:rPr>
-          <w:rtl w:val="0"/>
-        </w:rPr>
+        <w:t>AI-Assisted Resume Generation System | GitHub | 2026</w:t>
+      </w:r>
+    </w:p>
+    <w:p>
+      <w:pPr>
+        <w:pStyle w:val="Default"/>
+        <w:suppressAutoHyphens w:val="1"/>
+        <w:spacing w:before="0" w:after="240" w:line="240" w:lineRule="auto"/>
+        <w:rPr>
+          <w:rFonts w:ascii="Times Roman" w:cs="Times Roman" w:hAnsi="Times Roman" w:eastAsia="Times Roman"/>
+        </w:rPr>
+      </w:pPr>
+      <w:r>
+        <w:rPr>
+          <w:rFonts w:ascii="Times Roman" w:hAnsi="Times Roman" w:hint="default"/>
+          <w:rtl w:val="0"/>
+          <w:lang w:val="en-US"/>
+        </w:rPr>
+        <w:t xml:space="preserve">• </w:t>
+      </w:r>
+      <w:r>
+        <w:rPr>
+          <w:rFonts w:ascii="Times Roman" w:hAnsi="Times Roman"/>
+          <w:rtl w:val="0"/>
+          <w:lang w:val="en-US"/>
+        </w:rPr>
+        <w:t>Built an evidence-driven resume generation pipeline that converts a master resume into canonical JSON, extracts candidate evidence, maps evidence to market-derived role signals, and assembles targeted resume variants through structured LLM workflows.</w:t>
+      </w:r>
+    </w:p>
+    <w:p>
+      <w:pPr>
+        <w:pStyle w:val="Default"/>
+        <w:suppressAutoHyphens w:val="1"/>
+        <w:spacing w:before="0" w:after="240" w:line="240" w:lineRule="auto"/>
+        <w:rPr>
+          <w:rFonts w:ascii="Times Roman" w:cs="Times Roman" w:hAnsi="Times Roman" w:eastAsia="Times Roman"/>
+        </w:rPr>
+      </w:pPr>
+      <w:r>
+        <w:rPr>
+          <w:rFonts w:ascii="Times Roman" w:hAnsi="Times Roman" w:hint="default"/>
+          <w:rtl w:val="0"/>
+          <w:lang w:val="en-US"/>
+        </w:rPr>
+        <w:t xml:space="preserve">• </w:t>
+      </w:r>
+      <w:r>
+        <w:rPr>
+          <w:rFonts w:ascii="Times Roman" w:hAnsi="Times Roman"/>
+          <w:rtl w:val="0"/>
+          <w:lang w:val="en-US"/>
+        </w:rPr>
+        <w:t>Implemented versioned artifacts, human review checkpoints, traceable evidence IDs, and DOCX/PDF rendering controls to separate source evidence, content selection, positioning, and presentation layout.</w:t>
+      </w:r>
+    </w:p>
+    <w:p>
+      <w:pPr>
+        <w:pStyle w:val="Body A"/>
+        <w:spacing w:before="240" w:after="240"/>
+      </w:pPr>
+    </w:p>
+    <w:p>
+      <w:pPr>
+        <w:pStyle w:val="Body A"/>
+        <w:spacing w:before="240" w:after="240"/>
+      </w:pPr>
+      <w:r>
+        <w:rPr>
+          <w:rtl w:val="0"/>
+          <w:lang w:val="en-US"/>
+        </w:rPr>
+        <w:t>EDUCATION</w:t>
+      </w:r>
+    </w:p>
+    <w:p>
+      <w:pPr>
+        <w:pStyle w:val="Body A"/>
+        <w:spacing w:before="240" w:after="240"/>
+      </w:pPr>
+      <w:r>
+        <w:rPr>
+          <w:rtl w:val="0"/>
+          <w:lang w:val="en-US"/>
+        </w:rPr>
+        <w:t>MBA, UCLA Anderson School of Management</w:t>
+      </w:r>
+      <w:r>
         <w:br w:type="textWrapping"/>
-        <w:t xml:space="preserve">• </w:t>
-      </w:r>
-      <w:r>
-        <w:rPr>
-          <w:rtl w:val="0"/>
-          <w:lang w:val="en-US"/>
-        </w:rPr>
-        <w:t>Orchestrated structured retrieval, layout planning, and di</w:t>
-      </w:r>
-      <w:r>
-        <w:rPr>
-          <w:rFonts w:ascii="Arial Unicode MS" w:hAnsi="Arial Unicode MS" w:hint="default"/>
-          <w:rtl w:val="0"/>
-        </w:rPr>
-        <w:t>ﬀ</w:t>
-      </w:r>
-      <w:r>
-        <w:rPr>
-          <w:rtl w:val="0"/>
-          <w:lang w:val="en-US"/>
-        </w:rPr>
-        <w:t xml:space="preserve">usion prompting to generate data-driven posters/maps with repeatable, template-based workflows. </w:t>
-      </w:r>
-      <w:r>
-        <w:rPr>
-          <w:rtl w:val="0"/>
-        </w:rPr>
+      </w:r>
+      <w:r>
+        <w:rPr>
+          <w:rtl w:val="0"/>
+          <w:lang w:val="en-US"/>
+        </w:rPr>
+        <w:t>Top Honors, GPA: 3.9</w:t>
+      </w:r>
+    </w:p>
+    <w:p>
+      <w:pPr>
+        <w:pStyle w:val="Body A"/>
+        <w:spacing w:before="240" w:after="240"/>
+      </w:pPr>
+      <w:r>
+        <w:rPr>
+          <w:rtl w:val="0"/>
+          <w:lang w:val="en-US"/>
+        </w:rPr>
+        <w:t>M.S., Applied Statistics, Rochester Institute of Technology</w:t>
+      </w:r>
+      <w:r>
         <w:br w:type="textWrapping"/>
-        <w:t xml:space="preserve">• </w:t>
-      </w:r>
-      <w:r>
-        <w:rPr>
-          <w:rtl w:val="0"/>
-          <w:lang w:val="en-US"/>
-        </w:rPr>
-        <w:t>Implemented template constraints and parameterized prompts to ensure consistency across runs.</w:t>
+      </w:r>
+      <w:r>
+        <w:rPr>
+          <w:rtl w:val="0"/>
+        </w:rPr>
+        <w:t>GPA: 3.9</w:t>
       </w:r>
     </w:p>
     <w:p>
@@ -1544,6 +1621,22 @@
         <w:pStyle w:val="Body A"/>
         <w:spacing w:before="240" w:after="240"/>
       </w:pPr>
+      <w:r>
+        <w:rPr>
+          <w:rtl w:val="0"/>
+          <w:lang w:val="en-US"/>
+        </w:rPr>
+        <w:t>M.S., Electrical Engineering, University of Washington</w:t>
+      </w:r>
+      <w:r>
+        <w:br w:type="textWrapping"/>
+      </w:r>
+      <w:r>
+        <w:rPr>
+          <w:rtl w:val="0"/>
+        </w:rPr>
+        <w:t>GPA: 3.7</w:t>
+      </w:r>
     </w:p>
     <w:p>
       <w:pPr>
@@ -1555,7 +1648,16 @@
           <w:rtl w:val="0"/>
           <w:lang w:val="en-US"/>
         </w:rPr>
-        <w:t>EDUCATION</w:t>
+        <w:t>B.S., Physics (Minor: Mathematics), Humboldt State University</w:t>
+      </w:r>
+      <w:r>
+        <w:br w:type="textWrapping"/>
+      </w:r>
+      <w:r>
+        <w:rPr>
+          <w:rtl w:val="0"/>
+        </w:rPr>
+        <w:t>GPA: 3.4</w:t>
       </w:r>
     </w:p>
     <w:p>
@@ -1563,12 +1665,31 @@
         <w:pStyle w:val="Body A"/>
         <w:spacing w:before="240" w:after="240"/>
       </w:pPr>
-      <w:r>
-        <w:rPr>
-          <w:rtl w:val="0"/>
-          <w:lang w:val="en-US"/>
-        </w:rPr>
-        <w:t>MBA, UCLA Anderson School of Management</w:t>
+    </w:p>
+    <w:p>
+      <w:pPr>
+        <w:pStyle w:val="Body A"/>
+        <w:spacing w:before="240" w:after="240"/>
+      </w:pPr>
+      <w:r>
+        <w:rPr>
+          <w:rtl w:val="0"/>
+          <w:lang w:val="en-US"/>
+        </w:rPr>
+        <w:t>PATENTS &amp; RECOGNITION</w:t>
+      </w:r>
+    </w:p>
+    <w:p>
+      <w:pPr>
+        <w:pStyle w:val="Body A"/>
+        <w:spacing w:before="240" w:after="240"/>
+      </w:pPr>
+      <w:r>
+        <w:rPr>
+          <w:rtl w:val="0"/>
+          <w:lang w:val="en-US"/>
+        </w:rPr>
+        <w:t>Lead Inventor, U.S. Patent #8635622</w:t>
       </w:r>
       <w:r>
         <w:br w:type="textWrapping"/>
@@ -1578,7 +1699,7 @@
           <w:rtl w:val="0"/>
           <w:lang w:val="en-US"/>
         </w:rPr>
-        <w:t>Top Honors, GPA: 3.9</w:t>
+        <w:t>Method and System for Resource Management Using Fuzzy Logic Timeline Filling (2014)</w:t>
       </w:r>
     </w:p>
     <w:p>
@@ -1591,16 +1712,7 @@
           <w:rtl w:val="0"/>
           <w:lang w:val="en-US"/>
         </w:rPr>
-        <w:t>M.S., Applied Statistics, Rochester Institute of Technology</w:t>
-      </w:r>
-      <w:r>
-        <w:br w:type="textWrapping"/>
-      </w:r>
-      <w:r>
-        <w:rPr>
-          <w:rtl w:val="0"/>
-        </w:rPr>
-        <w:t>GPA: 3.9</w:t>
+        <w:t>Capital One Business Technology Innovation Award (2014)</w:t>
       </w:r>
     </w:p>
     <w:p>
@@ -1613,128 +1725,7 @@
           <w:rtl w:val="0"/>
           <w:lang w:val="en-US"/>
         </w:rPr>
-        <w:t>M.S., Electrical Engineering, University of Washington</w:t>
-      </w:r>
-      <w:r>
-        <w:br w:type="textWrapping"/>
-      </w:r>
-      <w:r>
-        <w:rPr>
-          <w:rtl w:val="0"/>
-        </w:rPr>
-        <w:t>GPA: 3.7</w:t>
-      </w:r>
-    </w:p>
-    <w:p>
-      <w:pPr>
-        <w:pStyle w:val="Body A"/>
-        <w:spacing w:before="240" w:after="240"/>
-      </w:pPr>
-      <w:r>
-        <w:rPr>
-          <w:rtl w:val="0"/>
-          <w:lang w:val="en-US"/>
-        </w:rPr>
-        <w:t>B.S., Physics (Minor: Mathematics), Humboldt State University</w:t>
-      </w:r>
-      <w:r>
-        <w:br w:type="textWrapping"/>
-      </w:r>
-      <w:r>
-        <w:rPr>
-          <w:rtl w:val="0"/>
-        </w:rPr>
-        <w:t>GPA: 3.4</w:t>
-      </w:r>
-    </w:p>
-    <w:p>
-      <w:pPr>
-        <w:pStyle w:val="Body A"/>
-        <w:spacing w:before="240" w:after="240"/>
-      </w:pPr>
-    </w:p>
-    <w:p>
-      <w:pPr>
-        <w:pStyle w:val="Body A"/>
-        <w:spacing w:before="240" w:after="240"/>
-      </w:pPr>
-      <w:r>
-        <w:rPr>
-          <w:rtl w:val="0"/>
-          <w:lang w:val="en-US"/>
-        </w:rPr>
-        <w:t>PATENTS &amp; RECOGNITION</w:t>
-      </w:r>
-    </w:p>
-    <w:p>
-      <w:pPr>
-        <w:pStyle w:val="Body A"/>
-        <w:spacing w:before="240" w:after="240"/>
-      </w:pPr>
-      <w:r>
-        <w:rPr>
-          <w:rtl w:val="0"/>
-          <w:lang w:val="en-US"/>
-        </w:rPr>
-        <w:t>Lead Inventor, U.S. Patent #8635622</w:t>
-      </w:r>
-      <w:r>
-        <w:br w:type="textWrapping"/>
-      </w:r>
-      <w:r>
-        <w:rPr>
-          <w:rtl w:val="0"/>
-          <w:lang w:val="en-US"/>
-        </w:rPr>
-        <w:t>Method and System for Resource Management Using Fuzzy Logic Timeline Filling (2014)</w:t>
-      </w:r>
-    </w:p>
-    <w:p>
-      <w:pPr>
-        <w:pStyle w:val="Body A"/>
-        <w:spacing w:before="240" w:after="240"/>
-      </w:pPr>
-      <w:r>
-        <w:rPr>
-          <w:rtl w:val="0"/>
-          <w:lang w:val="en-US"/>
-        </w:rPr>
-        <w:t>Capital One Business Technology Innovation Award (2014)</w:t>
-      </w:r>
-    </w:p>
-    <w:p>
-      <w:pPr>
-        <w:pStyle w:val="Body A"/>
-        <w:spacing w:before="240" w:after="240"/>
-      </w:pPr>
-      <w:r>
-        <w:rPr>
-          <w:rtl w:val="0"/>
-          <w:lang w:val="en-US"/>
-        </w:rPr>
         <w:t>Conference Chair &amp; Speaker - Customer Analytics Innovation Summit (2016)</w:t>
-      </w:r>
-    </w:p>
-    <w:p>
-      <w:pPr>
-        <w:pStyle w:val="Body A"/>
-        <w:spacing w:before="240" w:after="240"/>
-      </w:pPr>
-    </w:p>
-    <w:p>
-      <w:pPr>
-        <w:pStyle w:val="Body A"/>
-        <w:spacing w:before="240" w:after="240"/>
-      </w:pPr>
-      <w:r>
-        <w:rPr>
-          <w:rFonts w:ascii="Arial Unicode MS" w:cs="Arial Unicode MS" w:hAnsi="Arial Unicode MS" w:eastAsia="Arial Unicode MS"/>
-          <w:b w:val="0"/>
-          <w:bCs w:val="0"/>
-          <w:i w:val="0"/>
-          <w:iCs w:val="0"/>
-        </w:rPr>
-        <w:br w:type="page"/>
       </w:r>
     </w:p>
     <w:p>
@@ -2341,8 +2332,6 @@
         <w:spacing w:before="0" w:line="240" w:lineRule="auto"/>
         <w:rPr>
           <w:rFonts w:ascii="Times Roman" w:cs="Times Roman" w:hAnsi="Times Roman" w:eastAsia="Times Roman"/>
-          <w:sz w:val="24"/>
-          <w:szCs w:val="24"/>
         </w:rPr>
       </w:pPr>
       <w:r>
@@ -3393,8 +3382,6 @@
         <w:spacing w:before="0" w:line="240" w:lineRule="auto"/>
         <w:rPr>
           <w:rFonts w:ascii="Times Roman" w:cs="Times Roman" w:hAnsi="Times Roman" w:eastAsia="Times Roman"/>
-          <w:sz w:val="24"/>
-          <w:szCs w:val="24"/>
         </w:rPr>
       </w:pPr>
       <w:r>
@@ -3472,14 +3459,7 @@
           <w:rtl w:val="0"/>
           <w:lang w:val="en-US"/>
         </w:rPr>
-        <w:t xml:space="preserve">Digital </w:t>
-      </w:r>
-      <w:r>
-        <w:rPr>
-          <w:rtl w:val="0"/>
-          <w:lang w:val="en-US"/>
-        </w:rPr>
-        <w:t>Signal Processing</w:t>
+        <w:t>Digital Signal Processing</w:t>
       </w:r>
     </w:p>
     <w:p>
@@ -4084,15 +4064,150 @@
     </w:p>
     <w:p>
       <w:pPr>
+        <w:pStyle w:val="Body A"/>
+        <w:spacing w:before="240" w:after="240"/>
+        <w:rPr>
+          <w:rFonts w:ascii="Times Roman" w:cs="Times Roman" w:hAnsi="Times Roman" w:eastAsia="Times Roman"/>
+        </w:rPr>
+      </w:pPr>
+      <w:r>
+        <w:rPr>
+          <w:rtl w:val="0"/>
+        </w:rPr>
+        <w:t xml:space="preserve">Agentic Multimodal Orchestrator | GitHub | 2025 </w:t>
+      </w:r>
+      <w:r>
+        <w:rPr>
+          <w:rtl w:val="0"/>
+        </w:rPr>
+        <w:br w:type="textWrapping"/>
+        <w:t xml:space="preserve">• </w:t>
+      </w:r>
+      <w:r>
+        <w:rPr>
+          <w:rtl w:val="0"/>
+          <w:lang w:val="en-US"/>
+        </w:rPr>
+        <w:t>Orchestrated structured retrieval, layout planning, and di</w:t>
+      </w:r>
+      <w:r>
+        <w:rPr>
+          <w:rFonts w:ascii="Arial Unicode MS" w:hAnsi="Arial Unicode MS" w:hint="default"/>
+          <w:rtl w:val="0"/>
+        </w:rPr>
+        <w:t>ﬀ</w:t>
+      </w:r>
+      <w:r>
+        <w:rPr>
+          <w:rtl w:val="0"/>
+          <w:lang w:val="en-US"/>
+        </w:rPr>
+        <w:t xml:space="preserve">usion prompting to generate data-driven posters/maps with repeatable, template-based workflows. </w:t>
+      </w:r>
+      <w:r>
+        <w:rPr>
+          <w:rtl w:val="0"/>
+        </w:rPr>
+        <w:br w:type="textWrapping"/>
+        <w:t xml:space="preserve">• </w:t>
+      </w:r>
+      <w:r>
+        <w:rPr>
+          <w:rtl w:val="0"/>
+          <w:lang w:val="en-US"/>
+        </w:rPr>
+        <w:t>Implemented template constraints and parameterized prompts to ensure consistency across runs.</w:t>
+      </w:r>
+    </w:p>
+    <w:p>
+      <w:pPr>
         <w:pStyle w:val="Default"/>
         <w:suppressAutoHyphens w:val="1"/>
         <w:spacing w:before="0" w:line="240" w:lineRule="auto"/>
         <w:rPr>
           <w:rFonts w:ascii="Times Roman" w:cs="Times Roman" w:hAnsi="Times Roman" w:eastAsia="Times Roman"/>
+        </w:rPr>
+      </w:pPr>
+      <w:r>
+        <w:rPr>
+          <w:rFonts w:ascii="Arial" w:hAnsi="Arial"/>
+          <w:sz w:val="29"/>
+          <w:szCs w:val="29"/>
+          <w:rtl w:val="0"/>
+          <w:lang w:val="en-US"/>
+        </w:rPr>
+        <w:t>Speaking &amp; Teaching</w:t>
+      </w:r>
+    </w:p>
+    <w:p>
+      <w:pPr>
+        <w:pStyle w:val="Body A"/>
+        <w:spacing w:before="240" w:after="240"/>
+      </w:pPr>
+      <w:r>
+        <w:rPr>
+          <w:rtl w:val="0"/>
+          <w:lang w:val="en-US"/>
+        </w:rPr>
+        <w:t>Customer Analytics Innovation Summit (Chair)</w:t>
+      </w:r>
+    </w:p>
+    <w:p>
+      <w:pPr>
+        <w:pStyle w:val="Body A"/>
+        <w:spacing w:before="240" w:after="240"/>
+      </w:pPr>
+      <w:r>
+        <w:rPr>
+          <w:rtl w:val="0"/>
+          <w:lang w:val="en-US"/>
+        </w:rPr>
+        <w:t>Capital One internal conference presentations</w:t>
+      </w:r>
+    </w:p>
+    <w:p>
+      <w:pPr>
+        <w:pStyle w:val="Body A"/>
+        <w:spacing w:before="240" w:after="240"/>
+      </w:pPr>
+      <w:r>
+        <w:rPr>
+          <w:rtl w:val="0"/>
+          <w:lang w:val="en-US"/>
+        </w:rPr>
+        <w:t>External presentations on operational intelligence and monitoring</w:t>
+      </w:r>
+    </w:p>
+    <w:p>
+      <w:pPr>
+        <w:pStyle w:val="Body A"/>
+        <w:spacing w:before="240" w:after="240"/>
+      </w:pPr>
+      <w:r>
+        <w:rPr>
+          <w:rtl w:val="0"/>
+          <w:lang w:val="en-US"/>
+        </w:rPr>
+        <w:t>SimpliLearn AI/GenAI Instructor</w:t>
+      </w:r>
+    </w:p>
+    <w:p>
+      <w:pPr>
+        <w:pStyle w:val="Body A"/>
+        <w:spacing w:before="240" w:after="240"/>
+        <w:rPr>
+          <w:rFonts w:ascii="Times Roman" w:cs="Times Roman" w:hAnsi="Times Roman" w:eastAsia="Times Roman"/>
           <w:sz w:val="24"/>
           <w:szCs w:val="24"/>
         </w:rPr>
       </w:pPr>
+      <w:r>
+        <w:rPr>
+          <w:rtl w:val="0"/>
+          <w:lang w:val="en-US"/>
+        </w:rPr>
+        <w:t>Interview Kickstart AI Instructor</w:t>
+      </w:r>
     </w:p>
     <w:p>
       <w:pPr>
@@ -4110,9 +4225,9 @@
         <w:suppressAutoHyphens w:val="1"/>
         <w:spacing w:before="0" w:line="240" w:lineRule="auto"/>
         <w:rPr>
-          <w:rFonts w:ascii="Times Roman" w:cs="Times Roman" w:hAnsi="Times Roman" w:eastAsia="Times Roman"/>
-          <w:sz w:val="24"/>
-          <w:szCs w:val="24"/>
+          <w:rFonts w:ascii="Arial" w:cs="Arial" w:hAnsi="Arial" w:eastAsia="Arial"/>
+          <w:sz w:val="29"/>
+          <w:szCs w:val="29"/>
         </w:rPr>
       </w:pPr>
       <w:r>
@@ -4123,7 +4238,7 @@
           <w:rtl w:val="0"/>
           <w:lang w:val="en-US"/>
         </w:rPr>
-        <w:t>Speaking &amp; Teaching</w:t>
+        <w:t>Awards &amp; Recognition</w:t>
       </w:r>
     </w:p>
     <w:p>
@@ -4134,9 +4249,16 @@
       <w:r>
         <w:rPr>
           <w:rtl w:val="0"/>
-          <w:lang w:val="en-US"/>
-        </w:rPr>
-        <w:t>Customer Analytics Innovation Summit (Chair)</w:t>
+          <w:lang w:val="it-IT"/>
+        </w:rPr>
+        <w:t>Conference Chair &amp; Speaker</w:t>
+      </w:r>
+      <w:r>
+        <w:rPr>
+          <w:rtl w:val="0"/>
+          <w:lang w:val="en-US"/>
+        </w:rPr>
+        <w:t xml:space="preserve"> | Customer Analytics Innovation Summit (2016)</w:t>
       </w:r>
     </w:p>
     <w:p>
@@ -4149,51 +4271,7 @@
           <w:rtl w:val="0"/>
           <w:lang w:val="en-US"/>
         </w:rPr>
-        <w:t>Capital One internal conference presentations</w:t>
-      </w:r>
-    </w:p>
-    <w:p>
-      <w:pPr>
-        <w:pStyle w:val="Body A"/>
-        <w:spacing w:before="240" w:after="240"/>
-      </w:pPr>
-      <w:r>
-        <w:rPr>
-          <w:rtl w:val="0"/>
-          <w:lang w:val="en-US"/>
-        </w:rPr>
-        <w:t>External presentations on operational intelligence and monitoring</w:t>
-      </w:r>
-    </w:p>
-    <w:p>
-      <w:pPr>
-        <w:pStyle w:val="Body A"/>
-        <w:spacing w:before="240" w:after="240"/>
-      </w:pPr>
-      <w:r>
-        <w:rPr>
-          <w:rtl w:val="0"/>
-          <w:lang w:val="en-US"/>
-        </w:rPr>
-        <w:t>SimpliLearn AI/GenAI Instructor</w:t>
-      </w:r>
-    </w:p>
-    <w:p>
-      <w:pPr>
-        <w:pStyle w:val="Body A"/>
-        <w:spacing w:before="240" w:after="240"/>
-        <w:rPr>
-          <w:rFonts w:ascii="Times Roman" w:cs="Times Roman" w:hAnsi="Times Roman" w:eastAsia="Times Roman"/>
-          <w:sz w:val="24"/>
-          <w:szCs w:val="24"/>
-        </w:rPr>
-      </w:pPr>
-      <w:r>
-        <w:rPr>
-          <w:rtl w:val="0"/>
-          <w:lang w:val="en-US"/>
-        </w:rPr>
-        <w:t>Interview Kickstart AI Instructor</w:t>
+        <w:t>Capital One Business Technology Innovation Award (2014)</w:t>
       </w:r>
     </w:p>
     <w:p>
@@ -4202,16 +4280,6 @@
         <w:suppressAutoHyphens w:val="1"/>
         <w:spacing w:before="0" w:line="240" w:lineRule="auto"/>
         <w:rPr>
-          <w:rFonts w:ascii="Times Roman" w:cs="Times Roman" w:hAnsi="Times Roman" w:eastAsia="Times Roman"/>
-        </w:rPr>
-      </w:pPr>
-    </w:p>
-    <w:p>
-      <w:pPr>
-        <w:pStyle w:val="Default"/>
-        <w:suppressAutoHyphens w:val="1"/>
-        <w:spacing w:before="0" w:line="240" w:lineRule="auto"/>
-        <w:rPr>
           <w:rFonts w:ascii="Arial" w:cs="Arial" w:hAnsi="Arial" w:eastAsia="Arial"/>
           <w:sz w:val="29"/>
           <w:szCs w:val="29"/>
@@ -4225,92 +4293,20 @@
           <w:rtl w:val="0"/>
           <w:lang w:val="en-US"/>
         </w:rPr>
-        <w:t>Awards &amp; Recognition</w:t>
+        <w:t>Patents</w:t>
       </w:r>
     </w:p>
     <w:p>
       <w:pPr>
         <w:pStyle w:val="Body A"/>
         <w:spacing w:before="240" w:after="240"/>
-        <w:rPr>
-          <w:lang w:val="en-US"/>
-        </w:rPr>
-      </w:pPr>
-      <w:r>
-        <w:rPr>
-          <w:rtl w:val="0"/>
-          <w:lang w:val="it-IT"/>
-        </w:rPr>
-        <w:t>Conference Chair &amp; Speaker</w:t>
-      </w:r>
-      <w:r>
-        <w:rPr>
-          <w:rtl w:val="0"/>
-          <w:lang w:val="en-US"/>
-        </w:rPr>
-        <w:t xml:space="preserve"> | </w:t>
-      </w:r>
-      <w:r>
-        <w:rPr>
-          <w:rtl w:val="0"/>
-          <w:lang w:val="en-US"/>
-        </w:rPr>
-        <w:t>Customer Analytics Innovation Summit (2016)</w:t>
-      </w:r>
-    </w:p>
-    <w:p>
-      <w:pPr>
-        <w:pStyle w:val="Body A"/>
-        <w:spacing w:before="240" w:after="240"/>
-      </w:pPr>
-      <w:r>
-        <w:rPr>
-          <w:rtl w:val="0"/>
-          <w:lang w:val="en-US"/>
-        </w:rPr>
-        <w:t>Capital One Business Technology Innovation Award (2014)</w:t>
-      </w:r>
-    </w:p>
-    <w:p>
-      <w:pPr>
-        <w:pStyle w:val="Default"/>
-        <w:suppressAutoHyphens w:val="1"/>
-        <w:spacing w:before="0" w:line="240" w:lineRule="auto"/>
-        <w:rPr>
-          <w:rFonts w:ascii="Arial" w:cs="Arial" w:hAnsi="Arial" w:eastAsia="Arial"/>
-          <w:sz w:val="29"/>
-          <w:szCs w:val="29"/>
-        </w:rPr>
-      </w:pPr>
-      <w:r>
-        <w:rPr>
-          <w:rFonts w:ascii="Arial" w:hAnsi="Arial"/>
-          <w:sz w:val="29"/>
-          <w:szCs w:val="29"/>
-          <w:rtl w:val="0"/>
-          <w:lang w:val="en-US"/>
-        </w:rPr>
-        <w:t>Patents</w:t>
-      </w:r>
-    </w:p>
-    <w:p>
-      <w:pPr>
-        <w:pStyle w:val="Body A"/>
-        <w:spacing w:before="240" w:after="240"/>
-      </w:pPr>
-      <w:r>
-        <w:rPr>
-          <w:rtl w:val="0"/>
-          <w:lang w:val="en-US"/>
-        </w:rPr>
-        <w:t>Lead Inventor</w:t>
-      </w:r>
-      <w:r>
-        <w:rPr>
-          <w:rtl w:val="0"/>
-          <w:lang w:val="en-US"/>
-        </w:rPr>
-        <w:t xml:space="preserve">, </w:t>
+      </w:pPr>
+      <w:r>
+        <w:rPr>
+          <w:rtl w:val="0"/>
+          <w:lang w:val="en-US"/>
+        </w:rPr>
+        <w:t xml:space="preserve">Lead Inventor, </w:t>
       </w:r>
       <w:r>
         <w:rPr>
@@ -4324,35 +4320,21 @@
           <w:rtl w:val="0"/>
           <w:lang w:val="en-US"/>
         </w:rPr>
-        <w:t xml:space="preserve"> | </w:t>
-      </w:r>
-      <w:r>
-        <w:rPr>
-          <w:rtl w:val="0"/>
-          <w:lang w:val="en-US"/>
-        </w:rPr>
-        <w:t>"Method and System for Resource Management Using Fuzzy Logic Timeline Filling</w:t>
-      </w:r>
-      <w:r>
-        <w:rPr>
-          <w:rtl w:val="0"/>
-          <w:lang w:val="en-US"/>
-        </w:rPr>
-        <w:t>”</w:t>
-      </w:r>
-      <w:r>
-        <w:rPr>
-          <w:rtl w:val="0"/>
-          <w:lang w:val="en-US"/>
-        </w:rPr>
-        <w:t xml:space="preserve"> | </w:t>
-      </w:r>
-      <w:r>
-        <w:rPr>
-          <w:rtl w:val="0"/>
-          <w:lang w:val="en-US"/>
-        </w:rPr>
-        <w:t>Issued 2014</w:t>
+        <w:t xml:space="preserve"> | "Method and System for Resource Management Using Fuzzy Logic Timeline Filling</w:t>
+      </w:r>
+      <w:r>
+        <w:rPr>
+          <w:rtl w:val="0"/>
+          <w:lang w:val="en-US"/>
+        </w:rPr>
+        <w:t xml:space="preserve">” </w:t>
+      </w:r>
+      <w:r>
+        <w:rPr>
+          <w:rtl w:val="0"/>
+          <w:lang w:val="en-US"/>
+        </w:rPr>
+        <w:t>| Issued 2014</w:t>
       </w:r>
     </w:p>
     <w:p>
@@ -4385,8 +4367,7 @@
         <w:spacing w:before="0" w:line="240" w:lineRule="auto"/>
         <w:rPr>
           <w:rFonts w:ascii="Times Roman" w:cs="Times Roman" w:hAnsi="Times Roman" w:eastAsia="Times Roman"/>
-          <w:sz w:val="24"/>
-          <w:szCs w:val="24"/>
+          <w:lang w:val="fr-FR"/>
         </w:rPr>
       </w:pPr>
       <w:r>
@@ -4458,7 +4439,6 @@
         </w:rPr>
         <w:t>(Expired)</w:t>
       </w:r>
-      <w:r/>
     </w:p>
     <w:sectPr>
       <w:headerReference w:type="default" r:id="rId4"/>
@@ -10431,6 +10411,54 @@
       </w14:textFill>
     </w:rPr>
   </w:style>
+  <w:style w:type="paragraph" w:styleId="Default">
+    <w:name w:val="Default"/>
+    <w:next w:val="Default"/>
+    <w:pPr>
+      <w:keepNext w:val="0"/>
+      <w:keepLines w:val="0"/>
+      <w:pageBreakBefore w:val="0"/>
+      <w:widowControl w:val="1"/>
+      <w:shd w:val="clear" w:color="auto" w:fill="auto"/>
+      <w:suppressAutoHyphens w:val="0"/>
+      <w:bidi w:val="0"/>
+      <w:spacing w:before="160" w:after="0" w:line="288" w:lineRule="auto"/>
+      <w:ind w:left="0" w:right="0" w:firstLine="0"/>
+      <w:jc w:val="left"/>
+      <w:outlineLvl w:val="9"/>
+    </w:pPr>
+    <w:rPr>
+      <w:rFonts w:ascii="Helvetica Neue" w:cs="Arial Unicode MS" w:hAnsi="Helvetica Neue" w:eastAsia="Arial Unicode MS" w:hint="default"/>
+      <w:b w:val="0"/>
+      <w:bCs w:val="0"/>
+      <w:i w:val="0"/>
+      <w:iCs w:val="0"/>
+      <w:caps w:val="0"/>
+      <w:smallCaps w:val="0"/>
+      <w:strike w:val="0"/>
+      <w:dstrike w:val="0"/>
+      <w:outline w:val="0"/>
+      <w:color w:val="000000"/>
+      <w:spacing w:val="0"/>
+      <w:kern w:val="0"/>
+      <w:position w:val="0"/>
+      <w:sz w:val="24"/>
+      <w:szCs w:val="24"/>
+      <w:u w:val="none" w:color="000000"/>
+      <w:shd w:val="nil" w:color="auto" w:fill="auto"/>
+      <w:vertAlign w:val="baseline"/>
+      <w:lang w:val="en-US"/>
+      <w14:textOutline w14:w="12700" w14:cap="flat">
+        <w14:noFill/>
+        <w14:miter w14:lim="400000"/>
+      </w14:textOutline>
+      <w14:textFill>
+        <w14:solidFill>
+          <w14:srgbClr w14:val="000000"/>
+        </w14:solidFill>
+      </w14:textFill>
+    </w:rPr>
+  </w:style>
   <w:style w:type="numbering" w:styleId="Imported Style 13">
     <w:name w:val="Imported Style 13"/>
     <w:pPr>
@@ -10486,53 +10514,6 @@
         <w:numId w:val="13"/>
       </w:numPr>
     </w:pPr>
-  </w:style>
-  <w:style w:type="paragraph" w:styleId="Default">
-    <w:name w:val="Default"/>
-    <w:next w:val="Default"/>
-    <w:pPr>
-      <w:keepNext w:val="0"/>
-      <w:keepLines w:val="0"/>
-      <w:pageBreakBefore w:val="0"/>
-      <w:widowControl w:val="1"/>
-      <w:shd w:val="clear" w:color="auto" w:fill="auto"/>
-      <w:suppressAutoHyphens w:val="0"/>
-      <w:bidi w:val="0"/>
-      <w:spacing w:before="160" w:after="0" w:line="288" w:lineRule="auto"/>
-      <w:ind w:left="0" w:right="0" w:firstLine="0"/>
-      <w:jc w:val="left"/>
-      <w:outlineLvl w:val="9"/>
-    </w:pPr>
-    <w:rPr>
-      <w:rFonts w:ascii="Helvetica Neue" w:cs="Arial Unicode MS" w:hAnsi="Helvetica Neue" w:eastAsia="Arial Unicode MS"/>
-      <w:b w:val="0"/>
-      <w:bCs w:val="0"/>
-      <w:i w:val="0"/>
-      <w:iCs w:val="0"/>
-      <w:caps w:val="0"/>
-      <w:smallCaps w:val="0"/>
-      <w:strike w:val="0"/>
-      <w:dstrike w:val="0"/>
-      <w:outline w:val="0"/>
-      <w:color w:val="000000"/>
-      <w:spacing w:val="0"/>
-      <w:kern w:val="0"/>
-      <w:position w:val="0"/>
-      <w:sz w:val="24"/>
-      <w:szCs w:val="24"/>
-      <w:u w:val="none"/>
-      <w:shd w:val="nil" w:color="auto" w:fill="auto"/>
-      <w:vertAlign w:val="baseline"/>
-      <w:lang w:val="en-US"/>
-      <w14:textOutline>
-        <w14:noFill/>
-      </w14:textOutline>
-      <w14:textFill>
-        <w14:solidFill>
-          <w14:srgbClr w14:val="000000"/>
-        </w14:solidFill>
-      </w14:textFill>
-    </w:rPr>
   </w:style>
   <w:style w:type="numbering" w:styleId="Imported Style 5">
     <w:name w:val="Imported Style 5"/>

</xml_diff>